<commit_message>
Refactored map tile types | updated path, wall, and monster representations
</commit_message>
<xml_diff>
--- a/documentations/ResthiophaGame_Dokumantasyon_TR.docx
+++ b/documentations/ResthiophaGame_Dokumantasyon_TR.docx
@@ -6,325 +6,1368 @@
       <w:pPr>
         <w:pStyle w:val="Heading1"/>
       </w:pPr>
-      <w:r>
-        <w:t>Resthiopha Game - Teknik Dokümantasyon</w:t>
+      <w:proofErr w:type="spellStart"/>
+      <w:r>
+        <w:t>Resthiopha</w:t>
+      </w:r>
+      <w:proofErr w:type="spellEnd"/>
+      <w:r>
+        <w:t xml:space="preserve"> Game - </w:t>
+      </w:r>
+      <w:proofErr w:type="spellStart"/>
+      <w:r>
+        <w:t>Dokümantasyon</w:t>
+      </w:r>
+      <w:proofErr w:type="spellEnd"/>
+    </w:p>
+    <w:p/>
+    <w:p>
+      <w:r>
+        <w:rPr>
+          <w:noProof/>
+        </w:rPr>
+        <w:drawing>
+          <wp:inline distT="0" distB="0" distL="0" distR="0" wp14:anchorId="6DB0F802" wp14:editId="16C94755">
+            <wp:extent cx="3879961" cy="2338754"/>
+            <wp:effectExtent l="0" t="0" r="6350" b="0"/>
+            <wp:docPr id="1442252312" name="Picture 1" descr="A screenshot of a computer program&#10;&#10;AI-generated content may be incorrect."/>
+            <wp:cNvGraphicFramePr>
+              <a:graphicFrameLocks xmlns:a="http://schemas.openxmlformats.org/drawingml/2006/main" noChangeAspect="1"/>
+            </wp:cNvGraphicFramePr>
+            <a:graphic xmlns:a="http://schemas.openxmlformats.org/drawingml/2006/main">
+              <a:graphicData uri="http://schemas.openxmlformats.org/drawingml/2006/picture">
+                <pic:pic xmlns:pic="http://schemas.openxmlformats.org/drawingml/2006/picture">
+                  <pic:nvPicPr>
+                    <pic:cNvPr id="1442252312" name="Picture 1" descr="A screenshot of a computer program&#10;&#10;AI-generated content may be incorrect."/>
+                    <pic:cNvPicPr/>
+                  </pic:nvPicPr>
+                  <pic:blipFill>
+                    <a:blip r:embed="rId6"/>
+                    <a:stretch>
+                      <a:fillRect/>
+                    </a:stretch>
+                  </pic:blipFill>
+                  <pic:spPr>
+                    <a:xfrm>
+                      <a:off x="0" y="0"/>
+                      <a:ext cx="3911755" cy="2357919"/>
+                    </a:xfrm>
+                    <a:prstGeom prst="rect">
+                      <a:avLst/>
+                    </a:prstGeom>
+                  </pic:spPr>
+                </pic:pic>
+              </a:graphicData>
+            </a:graphic>
+          </wp:inline>
+        </w:drawing>
+      </w:r>
+    </w:p>
+    <w:p/>
+    <w:p>
+      <w:pPr>
+        <w:pStyle w:val="Heading2"/>
+      </w:pPr>
+      <w:r>
+        <w:t xml:space="preserve">Genel </w:t>
+      </w:r>
+      <w:proofErr w:type="spellStart"/>
+      <w:r>
+        <w:t>Bakış</w:t>
+      </w:r>
+      <w:proofErr w:type="spellEnd"/>
+    </w:p>
+    <w:p>
+      <w:proofErr w:type="spellStart"/>
+      <w:r>
+        <w:t>Resthiopha</w:t>
+      </w:r>
+      <w:proofErr w:type="spellEnd"/>
+      <w:r>
+        <w:t xml:space="preserve"> Game, Java Swing </w:t>
+      </w:r>
+      <w:proofErr w:type="spellStart"/>
+      <w:r>
+        <w:t>ile</w:t>
+      </w:r>
+      <w:proofErr w:type="spellEnd"/>
+      <w:r>
+        <w:t xml:space="preserve"> </w:t>
+      </w:r>
+      <w:proofErr w:type="spellStart"/>
+      <w:r>
+        <w:t>görsel</w:t>
+      </w:r>
+      <w:proofErr w:type="spellEnd"/>
+      <w:r>
+        <w:t xml:space="preserve"> </w:t>
+      </w:r>
+      <w:proofErr w:type="spellStart"/>
+      <w:r>
+        <w:t>arayüzü</w:t>
+      </w:r>
+      <w:proofErr w:type="spellEnd"/>
+      <w:r>
+        <w:t xml:space="preserve"> </w:t>
+      </w:r>
+      <w:proofErr w:type="spellStart"/>
+      <w:r>
+        <w:t>oluşturulmuş</w:t>
+      </w:r>
+      <w:proofErr w:type="spellEnd"/>
+      <w:r>
+        <w:t xml:space="preserve">, Spring Boot </w:t>
+      </w:r>
+      <w:proofErr w:type="spellStart"/>
+      <w:r>
+        <w:t>ile</w:t>
+      </w:r>
+      <w:proofErr w:type="spellEnd"/>
+      <w:r>
+        <w:t xml:space="preserve"> REST API </w:t>
+      </w:r>
+      <w:proofErr w:type="spellStart"/>
+      <w:r>
+        <w:t>ve</w:t>
+      </w:r>
+      <w:proofErr w:type="spellEnd"/>
+      <w:r>
+        <w:t xml:space="preserve"> </w:t>
+      </w:r>
+      <w:proofErr w:type="spellStart"/>
+      <w:r>
+        <w:t>veritabanı</w:t>
+      </w:r>
+      <w:proofErr w:type="spellEnd"/>
+      <w:r>
+        <w:t xml:space="preserve"> </w:t>
+      </w:r>
+      <w:proofErr w:type="spellStart"/>
+      <w:r>
+        <w:t>entegrasyonu</w:t>
+      </w:r>
+      <w:proofErr w:type="spellEnd"/>
+      <w:r>
+        <w:t xml:space="preserve"> </w:t>
+      </w:r>
+      <w:proofErr w:type="spellStart"/>
+      <w:r>
+        <w:t>olan</w:t>
+      </w:r>
+      <w:proofErr w:type="spellEnd"/>
+      <w:r>
+        <w:t xml:space="preserve"> 2D tile-</w:t>
+      </w:r>
+      <w:proofErr w:type="spellStart"/>
+      <w:r>
+        <w:t>tabanlı</w:t>
+      </w:r>
+      <w:proofErr w:type="spellEnd"/>
+      <w:r>
+        <w:t xml:space="preserve"> </w:t>
+      </w:r>
+      <w:proofErr w:type="spellStart"/>
+      <w:r>
+        <w:t>bir</w:t>
+      </w:r>
+      <w:proofErr w:type="spellEnd"/>
+      <w:r>
+        <w:t xml:space="preserve"> RPG </w:t>
+      </w:r>
+      <w:proofErr w:type="spellStart"/>
+      <w:r>
+        <w:t>oyunudur</w:t>
+      </w:r>
+      <w:proofErr w:type="spellEnd"/>
+      <w:r>
+        <w:t xml:space="preserve">. </w:t>
+      </w:r>
+      <w:proofErr w:type="spellStart"/>
+      <w:r>
+        <w:t>Oyuncu</w:t>
+      </w:r>
+      <w:proofErr w:type="spellEnd"/>
+      <w:r>
+        <w:t xml:space="preserve"> </w:t>
+      </w:r>
+      <w:proofErr w:type="spellStart"/>
+      <w:r>
+        <w:t>harita</w:t>
+      </w:r>
+      <w:proofErr w:type="spellEnd"/>
+      <w:r>
+        <w:t xml:space="preserve"> </w:t>
+      </w:r>
+      <w:proofErr w:type="spellStart"/>
+      <w:r>
+        <w:t>üzerinde</w:t>
+      </w:r>
+      <w:proofErr w:type="spellEnd"/>
+      <w:r>
+        <w:t xml:space="preserve"> </w:t>
+      </w:r>
+      <w:proofErr w:type="spellStart"/>
+      <w:r>
+        <w:t>hareket</w:t>
+      </w:r>
+      <w:proofErr w:type="spellEnd"/>
+      <w:r>
+        <w:t xml:space="preserve"> </w:t>
+      </w:r>
+      <w:proofErr w:type="spellStart"/>
+      <w:r>
+        <w:t>eder</w:t>
+      </w:r>
+      <w:proofErr w:type="spellEnd"/>
+      <w:r>
+        <w:t xml:space="preserve">, </w:t>
+      </w:r>
+      <w:proofErr w:type="spellStart"/>
+      <w:r>
+        <w:t>canavarlarla</w:t>
+      </w:r>
+      <w:proofErr w:type="spellEnd"/>
+      <w:r>
+        <w:t xml:space="preserve"> </w:t>
+      </w:r>
+      <w:proofErr w:type="spellStart"/>
+      <w:r>
+        <w:t>savaşır</w:t>
+      </w:r>
+      <w:proofErr w:type="spellEnd"/>
+      <w:r>
+        <w:t xml:space="preserve">, loot </w:t>
+      </w:r>
+      <w:proofErr w:type="spellStart"/>
+      <w:r>
+        <w:t>toplar</w:t>
+      </w:r>
+      <w:proofErr w:type="spellEnd"/>
+      <w:r>
+        <w:t xml:space="preserve"> </w:t>
+      </w:r>
+      <w:proofErr w:type="spellStart"/>
+      <w:r>
+        <w:t>ve</w:t>
+      </w:r>
+      <w:proofErr w:type="spellEnd"/>
+      <w:r>
+        <w:t xml:space="preserve"> </w:t>
+      </w:r>
+      <w:proofErr w:type="spellStart"/>
+      <w:r>
+        <w:t>envanteri</w:t>
+      </w:r>
+      <w:proofErr w:type="spellEnd"/>
+      <w:r>
+        <w:t xml:space="preserve"> </w:t>
+      </w:r>
+      <w:proofErr w:type="spellStart"/>
+      <w:r>
+        <w:t>yönetir</w:t>
+      </w:r>
+      <w:proofErr w:type="spellEnd"/>
+      <w:r>
+        <w:t>.</w:t>
       </w:r>
     </w:p>
     <w:p>
       <w:pPr>
         <w:pStyle w:val="Heading2"/>
       </w:pPr>
-      <w:r>
-        <w:t>Genel Bakış</w:t>
-      </w:r>
+      <w:proofErr w:type="spellStart"/>
+      <w:r>
+        <w:t>Proje</w:t>
+      </w:r>
+      <w:proofErr w:type="spellEnd"/>
+      <w:r>
+        <w:t xml:space="preserve"> </w:t>
+      </w:r>
+      <w:proofErr w:type="spellStart"/>
+      <w:r>
+        <w:t>Yapısı</w:t>
+      </w:r>
+      <w:proofErr w:type="spellEnd"/>
     </w:p>
     <w:p>
       <w:r>
-        <w:t>Resthiopha Game, Java Swing ile görsel arayüzü oluşturulmuş, Spring Boot ile REST API ve veritabanı entegrasyonu olan 2D tile-tabanlı bir RPG oyunudur. Oyuncu harita üzerinde hareket eder, canavarlarla savaşır, loot toplar ve envanteri yönetir.</w:t>
-      </w:r>
+        <w:t xml:space="preserve">- </w:t>
+      </w:r>
+      <w:proofErr w:type="spellStart"/>
+      <w:r>
+        <w:t>api</w:t>
+      </w:r>
+      <w:proofErr w:type="spellEnd"/>
+      <w:r>
+        <w:t xml:space="preserve"> → REST API </w:t>
+      </w:r>
+      <w:proofErr w:type="spellStart"/>
+      <w:r>
+        <w:t>katmanı</w:t>
+      </w:r>
+      <w:proofErr w:type="spellEnd"/>
+    </w:p>
+    <w:p>
+      <w:r>
+        <w:t xml:space="preserve">  - controller → REST </w:t>
+      </w:r>
+      <w:proofErr w:type="spellStart"/>
+      <w:r>
+        <w:t>uçları</w:t>
+      </w:r>
+      <w:proofErr w:type="spellEnd"/>
+    </w:p>
+    <w:p>
+      <w:r>
+        <w:t xml:space="preserve">  - model → DTO/Entity </w:t>
+      </w:r>
+      <w:proofErr w:type="spellStart"/>
+      <w:r>
+        <w:t>modelleri</w:t>
+      </w:r>
+      <w:proofErr w:type="spellEnd"/>
+    </w:p>
+    <w:p>
+      <w:r>
+        <w:t xml:space="preserve">  - repository → </w:t>
+      </w:r>
+      <w:proofErr w:type="spellStart"/>
+      <w:r>
+        <w:t>Veritabanı</w:t>
+      </w:r>
+      <w:proofErr w:type="spellEnd"/>
+      <w:r>
+        <w:t xml:space="preserve"> </w:t>
+      </w:r>
+      <w:proofErr w:type="spellStart"/>
+      <w:r>
+        <w:t>erişimi</w:t>
+      </w:r>
+      <w:proofErr w:type="spellEnd"/>
+    </w:p>
+    <w:p>
+      <w:r>
+        <w:t xml:space="preserve">  - service → </w:t>
+      </w:r>
+      <w:proofErr w:type="spellStart"/>
+      <w:r>
+        <w:t>İş</w:t>
+      </w:r>
+      <w:proofErr w:type="spellEnd"/>
+      <w:r>
+        <w:t xml:space="preserve"> </w:t>
+      </w:r>
+      <w:proofErr w:type="spellStart"/>
+      <w:r>
+        <w:t>mantığı</w:t>
+      </w:r>
+      <w:proofErr w:type="spellEnd"/>
+    </w:p>
+    <w:p>
+      <w:r>
+        <w:t xml:space="preserve">- entity → </w:t>
+      </w:r>
+      <w:proofErr w:type="spellStart"/>
+      <w:r>
+        <w:t>Oyuncu</w:t>
+      </w:r>
+      <w:proofErr w:type="spellEnd"/>
+      <w:r>
+        <w:t xml:space="preserve"> </w:t>
+      </w:r>
+      <w:proofErr w:type="spellStart"/>
+      <w:r>
+        <w:t>ve</w:t>
+      </w:r>
+      <w:proofErr w:type="spellEnd"/>
+      <w:r>
+        <w:t xml:space="preserve"> </w:t>
+      </w:r>
+      <w:proofErr w:type="spellStart"/>
+      <w:r>
+        <w:t>canavar</w:t>
+      </w:r>
+      <w:proofErr w:type="spellEnd"/>
+      <w:r>
+        <w:t xml:space="preserve"> </w:t>
+      </w:r>
+      <w:proofErr w:type="spellStart"/>
+      <w:r>
+        <w:t>sınıfları</w:t>
+      </w:r>
+      <w:proofErr w:type="spellEnd"/>
+    </w:p>
+    <w:p>
+      <w:r>
+        <w:t xml:space="preserve">- main → Oyun </w:t>
+      </w:r>
+      <w:proofErr w:type="spellStart"/>
+      <w:r>
+        <w:t>ekranı</w:t>
+      </w:r>
+      <w:proofErr w:type="spellEnd"/>
+      <w:r>
+        <w:t xml:space="preserve">, </w:t>
+      </w:r>
+      <w:proofErr w:type="spellStart"/>
+      <w:r>
+        <w:t>döngü</w:t>
+      </w:r>
+      <w:proofErr w:type="spellEnd"/>
+      <w:r>
+        <w:t xml:space="preserve"> </w:t>
+      </w:r>
+      <w:proofErr w:type="spellStart"/>
+      <w:r>
+        <w:t>ve</w:t>
+      </w:r>
+      <w:proofErr w:type="spellEnd"/>
+      <w:r>
+        <w:t xml:space="preserve"> </w:t>
+      </w:r>
+      <w:proofErr w:type="spellStart"/>
+      <w:r>
+        <w:t>kontroller</w:t>
+      </w:r>
+      <w:proofErr w:type="spellEnd"/>
+    </w:p>
+    <w:p>
+      <w:r>
+        <w:t xml:space="preserve">- tile → Harita </w:t>
+      </w:r>
+      <w:proofErr w:type="spellStart"/>
+      <w:r>
+        <w:t>yönetimi</w:t>
+      </w:r>
+      <w:proofErr w:type="spellEnd"/>
+      <w:r>
+        <w:t xml:space="preserve"> </w:t>
+      </w:r>
+      <w:proofErr w:type="spellStart"/>
+      <w:r>
+        <w:t>ve</w:t>
+      </w:r>
+      <w:proofErr w:type="spellEnd"/>
+      <w:r>
+        <w:t xml:space="preserve"> </w:t>
+      </w:r>
+      <w:proofErr w:type="spellStart"/>
+      <w:r>
+        <w:t>çizimi</w:t>
+      </w:r>
+      <w:proofErr w:type="spellEnd"/>
+    </w:p>
+    <w:p>
+      <w:r>
+        <w:t xml:space="preserve">- resources → map.txt </w:t>
+      </w:r>
+      <w:proofErr w:type="spellStart"/>
+      <w:r>
+        <w:t>ve</w:t>
+      </w:r>
+      <w:proofErr w:type="spellEnd"/>
+      <w:r>
+        <w:t xml:space="preserve"> Spring </w:t>
+      </w:r>
+      <w:proofErr w:type="spellStart"/>
+      <w:r>
+        <w:t>ayarları</w:t>
+      </w:r>
+      <w:proofErr w:type="spellEnd"/>
     </w:p>
     <w:p>
       <w:pPr>
         <w:pStyle w:val="Heading2"/>
       </w:pPr>
-      <w:r>
-        <w:t>Proje Yapısı</w:t>
-      </w:r>
+      <w:proofErr w:type="spellStart"/>
+      <w:r>
+        <w:t>Teknolojiler</w:t>
+      </w:r>
+      <w:proofErr w:type="spellEnd"/>
     </w:p>
     <w:p>
       <w:r>
-        <w:t>- api → REST API katmanı</w:t>
+        <w:t>- Java 17+</w:t>
       </w:r>
     </w:p>
     <w:p>
       <w:r>
-        <w:t xml:space="preserve">  - controller → REST uçları</w:t>
+        <w:lastRenderedPageBreak/>
+        <w:t>- Java Swing</w:t>
       </w:r>
     </w:p>
     <w:p>
       <w:r>
-        <w:t xml:space="preserve">  - model → DTO/Entity modelleri</w:t>
+        <w:t>- Spring Boot 3</w:t>
       </w:r>
     </w:p>
     <w:p>
       <w:r>
-        <w:t xml:space="preserve">  - repository → Veritabanı erişimi</w:t>
-      </w:r>
+        <w:t xml:space="preserve">- H2 </w:t>
+      </w:r>
+      <w:proofErr w:type="spellStart"/>
+      <w:r>
+        <w:t>Veritabanı</w:t>
+      </w:r>
+      <w:proofErr w:type="spellEnd"/>
     </w:p>
     <w:p>
       <w:r>
-        <w:t xml:space="preserve">  - service → İş mantığı</w:t>
-      </w:r>
-    </w:p>
-    <w:p>
-      <w:r>
-        <w:t>- entity → Oyuncu ve canavar sınıfları</w:t>
-      </w:r>
-    </w:p>
-    <w:p>
-      <w:r>
-        <w:t>- main → Oyun ekranı, döngü ve kontroller</w:t>
-      </w:r>
-    </w:p>
-    <w:p>
-      <w:r>
-        <w:t>- tile → Harita yönetimi ve çizimi</w:t>
-      </w:r>
-    </w:p>
-    <w:p>
-      <w:r>
-        <w:t>- resources → map.txt ve Spring ayarları</w:t>
+        <w:t>- Maven / Gradle</w:t>
       </w:r>
     </w:p>
     <w:p>
       <w:pPr>
         <w:pStyle w:val="Heading2"/>
       </w:pPr>
-      <w:r>
-        <w:t>Teknolojiler</w:t>
-      </w:r>
+      <w:proofErr w:type="spellStart"/>
+      <w:r>
+        <w:t>Oyuncu</w:t>
+      </w:r>
+      <w:proofErr w:type="spellEnd"/>
+      <w:r>
+        <w:t xml:space="preserve"> </w:t>
+      </w:r>
+      <w:proofErr w:type="spellStart"/>
+      <w:r>
+        <w:t>Kontrolleri</w:t>
+      </w:r>
+      <w:proofErr w:type="spellEnd"/>
     </w:p>
     <w:p>
       <w:r>
-        <w:t>- Java 17+</w:t>
-      </w:r>
+        <w:t xml:space="preserve">- W A S D → </w:t>
+      </w:r>
+      <w:proofErr w:type="spellStart"/>
+      <w:r>
+        <w:t>Hareket</w:t>
+      </w:r>
+      <w:proofErr w:type="spellEnd"/>
     </w:p>
     <w:p>
       <w:r>
-        <w:t>- Java Swing</w:t>
-      </w:r>
+        <w:t xml:space="preserve">- I → </w:t>
+      </w:r>
+      <w:proofErr w:type="spellStart"/>
+      <w:r>
+        <w:t>Envanteri</w:t>
+      </w:r>
+      <w:proofErr w:type="spellEnd"/>
+      <w:r>
+        <w:t xml:space="preserve"> </w:t>
+      </w:r>
+      <w:proofErr w:type="spellStart"/>
+      <w:r>
+        <w:t>aç</w:t>
+      </w:r>
+      <w:proofErr w:type="spellEnd"/>
+      <w:r>
+        <w:t>/</w:t>
+      </w:r>
+      <w:proofErr w:type="spellStart"/>
+      <w:r>
+        <w:t>kapat</w:t>
+      </w:r>
+      <w:proofErr w:type="spellEnd"/>
     </w:p>
     <w:p>
       <w:r>
-        <w:t>- Spring Boot 3</w:t>
-      </w:r>
+        <w:t xml:space="preserve">- Q → </w:t>
+      </w:r>
+      <w:proofErr w:type="spellStart"/>
+      <w:r>
+        <w:t>Eşyayı</w:t>
+      </w:r>
+      <w:proofErr w:type="spellEnd"/>
+      <w:r>
+        <w:t xml:space="preserve"> </w:t>
+      </w:r>
+      <w:proofErr w:type="spellStart"/>
+      <w:r>
+        <w:t>kuşan</w:t>
+      </w:r>
+      <w:proofErr w:type="spellEnd"/>
     </w:p>
     <w:p>
       <w:r>
-        <w:t>- H2 Veritabanı</w:t>
+        <w:t xml:space="preserve">- E → </w:t>
+      </w:r>
+      <w:proofErr w:type="spellStart"/>
+      <w:r>
+        <w:t>Eşyayı</w:t>
+      </w:r>
+      <w:proofErr w:type="spellEnd"/>
+      <w:r>
+        <w:t xml:space="preserve"> sat</w:t>
       </w:r>
     </w:p>
     <w:p>
       <w:r>
-        <w:t>- Maven / Gradle</w:t>
-      </w:r>
+        <w:t xml:space="preserve">- Y / N → Game Over </w:t>
+      </w:r>
+      <w:proofErr w:type="spellStart"/>
+      <w:r>
+        <w:t>seçim</w:t>
+      </w:r>
+      <w:proofErr w:type="spellEnd"/>
     </w:p>
     <w:p>
       <w:pPr>
         <w:pStyle w:val="Heading2"/>
       </w:pPr>
       <w:r>
-        <w:t>Oyuncu Kontrolleri</w:t>
-      </w:r>
+        <w:t xml:space="preserve">Oyun </w:t>
+      </w:r>
+      <w:proofErr w:type="spellStart"/>
+      <w:r>
+        <w:t>Mekanikleri</w:t>
+      </w:r>
+      <w:proofErr w:type="spellEnd"/>
     </w:p>
     <w:p>
       <w:r>
-        <w:t>- W A S D → Hareket</w:t>
-      </w:r>
+        <w:t xml:space="preserve">- </w:t>
+      </w:r>
+      <w:proofErr w:type="spellStart"/>
+      <w:r>
+        <w:t>Canavarlar</w:t>
+      </w:r>
+      <w:proofErr w:type="spellEnd"/>
+      <w:r>
+        <w:t xml:space="preserve"> </w:t>
+      </w:r>
+      <w:proofErr w:type="spellStart"/>
+      <w:r>
+        <w:t>rastgele</w:t>
+      </w:r>
+      <w:proofErr w:type="spellEnd"/>
+      <w:r>
+        <w:t xml:space="preserve"> </w:t>
+      </w:r>
+      <w:proofErr w:type="spellStart"/>
+      <w:r>
+        <w:t>veya</w:t>
+      </w:r>
+      <w:proofErr w:type="spellEnd"/>
+      <w:r>
+        <w:t xml:space="preserve"> </w:t>
+      </w:r>
+      <w:proofErr w:type="spellStart"/>
+      <w:r>
+        <w:t>oyuncuya</w:t>
+      </w:r>
+      <w:proofErr w:type="spellEnd"/>
+      <w:r>
+        <w:t xml:space="preserve"> </w:t>
+      </w:r>
+      <w:proofErr w:type="spellStart"/>
+      <w:r>
+        <w:t>yönelerek</w:t>
+      </w:r>
+      <w:proofErr w:type="spellEnd"/>
+      <w:r>
+        <w:t xml:space="preserve"> </w:t>
+      </w:r>
+      <w:proofErr w:type="spellStart"/>
+      <w:r>
+        <w:t>hareket</w:t>
+      </w:r>
+      <w:proofErr w:type="spellEnd"/>
+      <w:r>
+        <w:t xml:space="preserve"> </w:t>
+      </w:r>
+      <w:proofErr w:type="spellStart"/>
+      <w:r>
+        <w:t>eder</w:t>
+      </w:r>
+      <w:proofErr w:type="spellEnd"/>
     </w:p>
     <w:p>
       <w:r>
-        <w:t>- I → Envanteri aç/kapat</w:t>
-      </w:r>
+        <w:t xml:space="preserve">- </w:t>
+      </w:r>
+      <w:proofErr w:type="spellStart"/>
+      <w:r>
+        <w:t>Yakınsa</w:t>
+      </w:r>
+      <w:proofErr w:type="spellEnd"/>
+      <w:r>
+        <w:t xml:space="preserve"> </w:t>
+      </w:r>
+      <w:proofErr w:type="spellStart"/>
+      <w:r>
+        <w:t>saldırır</w:t>
+      </w:r>
+      <w:proofErr w:type="spellEnd"/>
     </w:p>
     <w:p>
       <w:r>
-        <w:t>- Q → Eşyayı kuşan</w:t>
-      </w:r>
+        <w:t xml:space="preserve">- Sword </w:t>
+      </w:r>
+      <w:proofErr w:type="spellStart"/>
+      <w:r>
+        <w:t>ya</w:t>
+      </w:r>
+      <w:proofErr w:type="spellEnd"/>
+      <w:r>
+        <w:t xml:space="preserve"> da Shoes loot </w:t>
+      </w:r>
+      <w:proofErr w:type="spellStart"/>
+      <w:r>
+        <w:t>düşer</w:t>
+      </w:r>
+      <w:proofErr w:type="spellEnd"/>
     </w:p>
     <w:p>
       <w:r>
-        <w:t>- E → Eşyayı sat</w:t>
-      </w:r>
+        <w:t xml:space="preserve">- Daha iyi </w:t>
+      </w:r>
+      <w:proofErr w:type="spellStart"/>
+      <w:r>
+        <w:t>eşya</w:t>
+      </w:r>
+      <w:proofErr w:type="spellEnd"/>
+      <w:r>
+        <w:t xml:space="preserve"> </w:t>
+      </w:r>
+      <w:proofErr w:type="spellStart"/>
+      <w:r>
+        <w:t>varsa</w:t>
+      </w:r>
+      <w:proofErr w:type="spellEnd"/>
+      <w:r>
+        <w:t xml:space="preserve"> </w:t>
+      </w:r>
+      <w:proofErr w:type="spellStart"/>
+      <w:r>
+        <w:t>otomatik</w:t>
+      </w:r>
+      <w:proofErr w:type="spellEnd"/>
+      <w:r>
+        <w:t xml:space="preserve"> </w:t>
+      </w:r>
+      <w:proofErr w:type="spellStart"/>
+      <w:r>
+        <w:t>kuşanılır</w:t>
+      </w:r>
+      <w:proofErr w:type="spellEnd"/>
     </w:p>
     <w:p>
       <w:r>
-        <w:t>- Y / N → Game Over seçim</w:t>
-      </w:r>
+        <w:t xml:space="preserve">- </w:t>
+      </w:r>
+      <w:proofErr w:type="spellStart"/>
+      <w:r>
+        <w:t>Envanter</w:t>
+      </w:r>
+      <w:proofErr w:type="spellEnd"/>
+      <w:r>
+        <w:t xml:space="preserve"> </w:t>
+      </w:r>
+      <w:proofErr w:type="spellStart"/>
+      <w:r>
+        <w:t>ekranı</w:t>
+      </w:r>
+      <w:proofErr w:type="spellEnd"/>
+      <w:r>
+        <w:t xml:space="preserve"> </w:t>
+      </w:r>
+      <w:proofErr w:type="spellStart"/>
+      <w:r>
+        <w:t>oyun</w:t>
+      </w:r>
+      <w:proofErr w:type="spellEnd"/>
+      <w:r>
+        <w:t xml:space="preserve"> </w:t>
+      </w:r>
+      <w:proofErr w:type="spellStart"/>
+      <w:r>
+        <w:t>akışını</w:t>
+      </w:r>
+      <w:proofErr w:type="spellEnd"/>
+      <w:r>
+        <w:t xml:space="preserve"> </w:t>
+      </w:r>
+      <w:proofErr w:type="spellStart"/>
+      <w:r>
+        <w:t>durdurur</w:t>
+      </w:r>
+      <w:proofErr w:type="spellEnd"/>
     </w:p>
     <w:p>
       <w:pPr>
         <w:pStyle w:val="Heading2"/>
       </w:pPr>
       <w:r>
-        <w:lastRenderedPageBreak/>
-        <w:t>Oyun Mekanikleri</w:t>
-      </w:r>
+        <w:t xml:space="preserve">REST API </w:t>
+      </w:r>
+      <w:proofErr w:type="spellStart"/>
+      <w:r>
+        <w:t>Uçları</w:t>
+      </w:r>
+      <w:proofErr w:type="spellEnd"/>
     </w:p>
     <w:p>
-      <w:r>
-        <w:t>- Canavarlar rastgele veya oyuncuya yönelerek hareket eder</w:t>
+      <w:proofErr w:type="spellStart"/>
+      <w:r>
+        <w:t>GearController</w:t>
+      </w:r>
+      <w:proofErr w:type="spellEnd"/>
+      <w:r>
+        <w:t>:</w:t>
       </w:r>
     </w:p>
     <w:p>
       <w:r>
-        <w:t>- Yakınsa saldırır</w:t>
+        <w:t>- GET /</w:t>
+      </w:r>
+      <w:proofErr w:type="spellStart"/>
+      <w:r>
+        <w:t>api</w:t>
+      </w:r>
+      <w:proofErr w:type="spellEnd"/>
+      <w:r>
+        <w:t xml:space="preserve">/items/random → </w:t>
+      </w:r>
+      <w:proofErr w:type="spellStart"/>
+      <w:r>
+        <w:t>Rastgele</w:t>
+      </w:r>
+      <w:proofErr w:type="spellEnd"/>
+      <w:r>
+        <w:t xml:space="preserve"> loot döner</w:t>
       </w:r>
     </w:p>
     <w:p>
       <w:r>
-        <w:t>- Sword ya da Shoes loot düşer</w:t>
+        <w:t>- GET /</w:t>
+      </w:r>
+      <w:proofErr w:type="spellStart"/>
+      <w:r>
+        <w:t>api</w:t>
+      </w:r>
+      <w:proofErr w:type="spellEnd"/>
+      <w:r>
+        <w:t xml:space="preserve">/items → </w:t>
+      </w:r>
+      <w:proofErr w:type="spellStart"/>
+      <w:r>
+        <w:t>Tüm</w:t>
+      </w:r>
+      <w:proofErr w:type="spellEnd"/>
+      <w:r>
+        <w:t xml:space="preserve"> </w:t>
+      </w:r>
+      <w:proofErr w:type="spellStart"/>
+      <w:r>
+        <w:t>lootları</w:t>
+      </w:r>
+      <w:proofErr w:type="spellEnd"/>
+      <w:r>
+        <w:t xml:space="preserve"> döner</w:t>
+      </w:r>
+    </w:p>
+    <w:p/>
+    <w:p>
+      <w:proofErr w:type="spellStart"/>
+      <w:r>
+        <w:t>PlayerController</w:t>
+      </w:r>
+      <w:proofErr w:type="spellEnd"/>
+      <w:r>
+        <w:t>:</w:t>
       </w:r>
     </w:p>
     <w:p>
       <w:r>
-        <w:t>- Daha iyi eşya varsa otomatik kuşanılır</w:t>
+        <w:t>- GET /</w:t>
+      </w:r>
+      <w:proofErr w:type="spellStart"/>
+      <w:r>
+        <w:t>api</w:t>
+      </w:r>
+      <w:proofErr w:type="spellEnd"/>
+      <w:r>
+        <w:t xml:space="preserve">/player/coins → Coin </w:t>
+      </w:r>
+      <w:proofErr w:type="spellStart"/>
+      <w:r>
+        <w:t>miktarını</w:t>
+      </w:r>
+      <w:proofErr w:type="spellEnd"/>
+      <w:r>
+        <w:t xml:space="preserve"> döner</w:t>
       </w:r>
     </w:p>
     <w:p>
       <w:r>
-        <w:t>- Envanter ekranı oyun akışını durdurur</w:t>
-      </w:r>
+        <w:t>- GET /</w:t>
+      </w:r>
+      <w:proofErr w:type="spellStart"/>
+      <w:r>
+        <w:t>api</w:t>
+      </w:r>
+      <w:proofErr w:type="spellEnd"/>
+      <w:r>
+        <w:t xml:space="preserve">/player/inventory → </w:t>
+      </w:r>
+      <w:proofErr w:type="spellStart"/>
+      <w:r>
+        <w:t>Envanteri</w:t>
+      </w:r>
+      <w:proofErr w:type="spellEnd"/>
+      <w:r>
+        <w:t xml:space="preserve"> döner</w:t>
+      </w:r>
+    </w:p>
+    <w:p>
+      <w:r>
+        <w:t>- GET /</w:t>
+      </w:r>
+      <w:proofErr w:type="spellStart"/>
+      <w:r>
+        <w:t>api</w:t>
+      </w:r>
+      <w:proofErr w:type="spellEnd"/>
+      <w:r>
+        <w:t xml:space="preserve">/player/equipment → </w:t>
+      </w:r>
+      <w:proofErr w:type="spellStart"/>
+      <w:r>
+        <w:t>Kuşanılan</w:t>
+      </w:r>
+      <w:proofErr w:type="spellEnd"/>
+      <w:r>
+        <w:t xml:space="preserve"> </w:t>
+      </w:r>
+      <w:proofErr w:type="spellStart"/>
+      <w:r>
+        <w:t>item'ları</w:t>
+      </w:r>
+      <w:proofErr w:type="spellEnd"/>
+      <w:r>
+        <w:t xml:space="preserve"> döner</w:t>
+      </w:r>
+    </w:p>
+    <w:p>
+      <w:r>
+        <w:t>- GET /</w:t>
+      </w:r>
+      <w:proofErr w:type="spellStart"/>
+      <w:r>
+        <w:t>api</w:t>
+      </w:r>
+      <w:proofErr w:type="spellEnd"/>
+      <w:r>
+        <w:t xml:space="preserve">/player/summary → </w:t>
+      </w:r>
+      <w:proofErr w:type="spellStart"/>
+      <w:r>
+        <w:t>Oyuncu</w:t>
+      </w:r>
+      <w:proofErr w:type="spellEnd"/>
+      <w:r>
+        <w:t xml:space="preserve"> </w:t>
+      </w:r>
+      <w:proofErr w:type="spellStart"/>
+      <w:r>
+        <w:t>özet</w:t>
+      </w:r>
+      <w:proofErr w:type="spellEnd"/>
+      <w:r>
+        <w:t xml:space="preserve"> </w:t>
+      </w:r>
+      <w:proofErr w:type="spellStart"/>
+      <w:r>
+        <w:t>bilgisi</w:t>
+      </w:r>
+      <w:proofErr w:type="spellEnd"/>
+    </w:p>
+    <w:p>
+      <w:r>
+        <w:t>- GET /</w:t>
+      </w:r>
+      <w:proofErr w:type="spellStart"/>
+      <w:r>
+        <w:t>api</w:t>
+      </w:r>
+      <w:proofErr w:type="spellEnd"/>
+      <w:r>
+        <w:t xml:space="preserve">/player → </w:t>
+      </w:r>
+      <w:proofErr w:type="spellStart"/>
+      <w:r>
+        <w:t>Oyuncu</w:t>
+      </w:r>
+      <w:proofErr w:type="spellEnd"/>
+      <w:r>
+        <w:t xml:space="preserve"> </w:t>
+      </w:r>
+      <w:proofErr w:type="spellStart"/>
+      <w:r>
+        <w:t>veritabanı</w:t>
+      </w:r>
+      <w:proofErr w:type="spellEnd"/>
+      <w:r>
+        <w:t xml:space="preserve"> </w:t>
+      </w:r>
+      <w:proofErr w:type="spellStart"/>
+      <w:r>
+        <w:t>kaydı</w:t>
+      </w:r>
+      <w:proofErr w:type="spellEnd"/>
+    </w:p>
+    <w:p>
+      <w:r>
+        <w:lastRenderedPageBreak/>
+        <w:t>- POST /</w:t>
+      </w:r>
+      <w:proofErr w:type="spellStart"/>
+      <w:r>
+        <w:t>api</w:t>
+      </w:r>
+      <w:proofErr w:type="spellEnd"/>
+      <w:r>
+        <w:t xml:space="preserve">/player/save → </w:t>
+      </w:r>
+      <w:proofErr w:type="spellStart"/>
+      <w:r>
+        <w:t>Oyuncu</w:t>
+      </w:r>
+      <w:proofErr w:type="spellEnd"/>
+      <w:r>
+        <w:t xml:space="preserve"> </w:t>
+      </w:r>
+      <w:proofErr w:type="spellStart"/>
+      <w:r>
+        <w:t>kaydeder</w:t>
+      </w:r>
+      <w:proofErr w:type="spellEnd"/>
     </w:p>
     <w:p>
       <w:pPr>
         <w:pStyle w:val="Heading2"/>
       </w:pPr>
       <w:r>
-        <w:t>REST API Uçları</w:t>
-      </w:r>
+        <w:t xml:space="preserve">Harita </w:t>
+      </w:r>
+      <w:proofErr w:type="spellStart"/>
+      <w:r>
+        <w:t>Sistemi</w:t>
+      </w:r>
+      <w:proofErr w:type="spellEnd"/>
     </w:p>
     <w:p>
       <w:r>
-        <w:t>GearController:</w:t>
-      </w:r>
+        <w:t xml:space="preserve">- map.txt </w:t>
+      </w:r>
+      <w:proofErr w:type="spellStart"/>
+      <w:r>
+        <w:t>dosyasından</w:t>
+      </w:r>
+      <w:proofErr w:type="spellEnd"/>
+      <w:r>
+        <w:t xml:space="preserve"> </w:t>
+      </w:r>
+      <w:proofErr w:type="spellStart"/>
+      <w:r>
+        <w:t>yüklenir</w:t>
+      </w:r>
+      <w:proofErr w:type="spellEnd"/>
     </w:p>
     <w:p>
       <w:r>
-        <w:t>- GET /api/items/random → Rastgele loot döner</w:t>
-      </w:r>
+        <w:t xml:space="preserve">- '1' / 'X' = </w:t>
+      </w:r>
+      <w:proofErr w:type="spellStart"/>
+      <w:r>
+        <w:t>Duvar</w:t>
+      </w:r>
+      <w:proofErr w:type="spellEnd"/>
     </w:p>
     <w:p>
       <w:r>
-        <w:t>- GET /api/items → Tüm lootları döner</w:t>
-      </w:r>
-    </w:p>
-    <w:p/>
-    <w:p>
-      <w:r>
-        <w:t>PlayerController:</w:t>
+        <w:t>- '0' / '.' = Yol</w:t>
       </w:r>
     </w:p>
     <w:p>
       <w:r>
-        <w:t>- GET /api/player/coins → Coin miktarını döner</w:t>
-      </w:r>
-    </w:p>
-    <w:p>
-      <w:r>
-        <w:t>- GET /api/player/inventory → Envanteri döner</w:t>
-      </w:r>
-    </w:p>
-    <w:p>
-      <w:r>
-        <w:t>- GET /api/player/equipment → Kuşanılan item'ları döner</w:t>
-      </w:r>
-    </w:p>
-    <w:p>
-      <w:r>
-        <w:t>- GET /api/player/summary → Oyuncu özet bilgisi</w:t>
-      </w:r>
-    </w:p>
-    <w:p>
-      <w:r>
-        <w:t>- GET /api/player → Oyuncu veritabanı kaydı</w:t>
-      </w:r>
-    </w:p>
-    <w:p>
-      <w:r>
-        <w:t>- POST /api/player/save → Oyuncu kaydeder</w:t>
-      </w:r>
+        <w:t xml:space="preserve">- 'P' = </w:t>
+      </w:r>
+      <w:proofErr w:type="spellStart"/>
+      <w:r>
+        <w:t>Oyuncu</w:t>
+      </w:r>
+      <w:proofErr w:type="spellEnd"/>
+      <w:r>
+        <w:t xml:space="preserve"> </w:t>
+      </w:r>
+      <w:proofErr w:type="spellStart"/>
+      <w:r>
+        <w:t>başlangıç</w:t>
+      </w:r>
+      <w:proofErr w:type="spellEnd"/>
+      <w:r>
+        <w:t xml:space="preserve"> </w:t>
+      </w:r>
+      <w:proofErr w:type="spellStart"/>
+      <w:r>
+        <w:t>noktası</w:t>
+      </w:r>
+      <w:proofErr w:type="spellEnd"/>
     </w:p>
     <w:p>
       <w:pPr>
         <w:pStyle w:val="Heading2"/>
       </w:pPr>
-      <w:r>
-        <w:t>Harita Sistemi</w:t>
-      </w:r>
+      <w:proofErr w:type="spellStart"/>
+      <w:r>
+        <w:t>Veritabanı</w:t>
+      </w:r>
+      <w:proofErr w:type="spellEnd"/>
     </w:p>
     <w:p>
       <w:r>
-        <w:t>- map.txt dosyasından yüklenir</w:t>
-      </w:r>
+        <w:t xml:space="preserve">- H2 </w:t>
+      </w:r>
+      <w:proofErr w:type="spellStart"/>
+      <w:r>
+        <w:t>bellekte</w:t>
+      </w:r>
+      <w:proofErr w:type="spellEnd"/>
+      <w:r>
+        <w:t xml:space="preserve"> </w:t>
+      </w:r>
+      <w:proofErr w:type="spellStart"/>
+      <w:r>
+        <w:t>çalışan</w:t>
+      </w:r>
+      <w:proofErr w:type="spellEnd"/>
+      <w:r>
+        <w:t xml:space="preserve"> </w:t>
+      </w:r>
+      <w:proofErr w:type="spellStart"/>
+      <w:r>
+        <w:t>veritabanı</w:t>
+      </w:r>
+      <w:proofErr w:type="spellEnd"/>
     </w:p>
     <w:p>
       <w:r>
-        <w:t>- '1' / 'X' = Duvar</w:t>
+        <w:t xml:space="preserve">- </w:t>
+      </w:r>
+      <w:proofErr w:type="spellStart"/>
+      <w:r>
+        <w:t>Konsol</w:t>
+      </w:r>
+      <w:proofErr w:type="spellEnd"/>
+      <w:r>
+        <w:t xml:space="preserve"> </w:t>
+      </w:r>
+      <w:proofErr w:type="spellStart"/>
+      <w:r>
+        <w:t>erişimi</w:t>
+      </w:r>
+      <w:proofErr w:type="spellEnd"/>
+      <w:r>
+        <w:t>: /h2-console</w:t>
       </w:r>
     </w:p>
     <w:p>
       <w:r>
-        <w:t>- '0' / '.' = Yol</w:t>
-      </w:r>
-    </w:p>
-    <w:p>
-      <w:r>
-        <w:t>- 'P' = Oyuncu başlangıç noktası</w:t>
-      </w:r>
+        <w:t xml:space="preserve">- </w:t>
+      </w:r>
+      <w:proofErr w:type="spellStart"/>
+      <w:r>
+        <w:t>PlayerEntity</w:t>
+      </w:r>
+      <w:proofErr w:type="spellEnd"/>
+      <w:r>
+        <w:t xml:space="preserve"> </w:t>
+      </w:r>
+      <w:proofErr w:type="spellStart"/>
+      <w:r>
+        <w:t>sınıfı</w:t>
+      </w:r>
+      <w:proofErr w:type="spellEnd"/>
+      <w:r>
+        <w:t xml:space="preserve"> @Entity </w:t>
+      </w:r>
+      <w:proofErr w:type="spellStart"/>
+      <w:r>
+        <w:t>ile</w:t>
+      </w:r>
+      <w:proofErr w:type="spellEnd"/>
+      <w:r>
+        <w:t xml:space="preserve"> </w:t>
+      </w:r>
+      <w:proofErr w:type="spellStart"/>
+      <w:r>
+        <w:t>eşleştirilir</w:t>
+      </w:r>
+      <w:proofErr w:type="spellEnd"/>
     </w:p>
     <w:p>
       <w:pPr>
         <w:pStyle w:val="Heading2"/>
       </w:pPr>
-      <w:r>
-        <w:t>Veritabanı</w:t>
-      </w:r>
+      <w:proofErr w:type="spellStart"/>
+      <w:r>
+        <w:t>Başlatma</w:t>
+      </w:r>
+      <w:proofErr w:type="spellEnd"/>
+      <w:r>
+        <w:t xml:space="preserve"> </w:t>
+      </w:r>
+      <w:proofErr w:type="spellStart"/>
+      <w:r>
+        <w:t>Adımları</w:t>
+      </w:r>
+      <w:proofErr w:type="spellEnd"/>
     </w:p>
     <w:p>
       <w:r>
-        <w:t>- H2 bellekte çalışan veritabanı</w:t>
-      </w:r>
+        <w:t xml:space="preserve">1. Spring </w:t>
+      </w:r>
+      <w:proofErr w:type="spellStart"/>
+      <w:r>
+        <w:t>Boot'u</w:t>
+      </w:r>
+      <w:proofErr w:type="spellEnd"/>
+      <w:r>
+        <w:t xml:space="preserve"> </w:t>
+      </w:r>
+      <w:proofErr w:type="spellStart"/>
+      <w:r>
+        <w:t>başlat</w:t>
+      </w:r>
+      <w:proofErr w:type="spellEnd"/>
+      <w:r>
+        <w:t xml:space="preserve">: </w:t>
+      </w:r>
+      <w:proofErr w:type="spellStart"/>
+      <w:r>
+        <w:t>ResthiophaGameApplication</w:t>
+      </w:r>
+      <w:proofErr w:type="spellEnd"/>
     </w:p>
     <w:p>
       <w:r>
-        <w:t>- Konsol erişimi: /h2-console</w:t>
-      </w:r>
-    </w:p>
-    <w:p>
-      <w:r>
-        <w:t>- PlayerEntity sınıfı @Entity ile eşleştirilir</w:t>
+        <w:t xml:space="preserve">2. Swing </w:t>
+      </w:r>
+      <w:proofErr w:type="spellStart"/>
+      <w:r>
+        <w:t>oyun</w:t>
+      </w:r>
+      <w:proofErr w:type="spellEnd"/>
+      <w:r>
+        <w:t xml:space="preserve"> </w:t>
+      </w:r>
+      <w:proofErr w:type="spellStart"/>
+      <w:r>
+        <w:t>penceresini</w:t>
+      </w:r>
+      <w:proofErr w:type="spellEnd"/>
+      <w:r>
+        <w:t xml:space="preserve"> </w:t>
+      </w:r>
+      <w:proofErr w:type="spellStart"/>
+      <w:r>
+        <w:t>başlat</w:t>
+      </w:r>
+      <w:proofErr w:type="spellEnd"/>
+      <w:r>
+        <w:t>: Main</w:t>
       </w:r>
     </w:p>
     <w:p>
       <w:pPr>
         <w:pStyle w:val="Heading2"/>
       </w:pPr>
-      <w:r>
-        <w:lastRenderedPageBreak/>
-        <w:t>Başlatma Adımları</w:t>
+      <w:proofErr w:type="spellStart"/>
+      <w:r>
+        <w:t>Geliştirme</w:t>
+      </w:r>
+      <w:proofErr w:type="spellEnd"/>
+      <w:r>
+        <w:t xml:space="preserve"> Fikirleri</w:t>
       </w:r>
     </w:p>
     <w:p>
       <w:r>
-        <w:t>1. Spring Boot'u başlat: ResthiophaGameApplication</w:t>
-      </w:r>
-    </w:p>
-    <w:p>
-      <w:r>
-        <w:t>2. Swing oyun penceresini başlat: Main</w:t>
-      </w:r>
+        <w:t xml:space="preserve">- </w:t>
+      </w:r>
+      <w:proofErr w:type="spellStart"/>
+      <w:r>
+        <w:t>Mağaza</w:t>
+      </w:r>
+      <w:proofErr w:type="spellEnd"/>
+      <w:r>
+        <w:t xml:space="preserve">, XP </w:t>
+      </w:r>
+      <w:proofErr w:type="spellStart"/>
+      <w:r>
+        <w:t>sistemi</w:t>
+      </w:r>
+      <w:proofErr w:type="spellEnd"/>
+      <w:r>
+        <w:t xml:space="preserve">, yeni </w:t>
+      </w:r>
+      <w:proofErr w:type="spellStart"/>
+      <w:r>
+        <w:t>haritalar</w:t>
+      </w:r>
+      <w:proofErr w:type="spellEnd"/>
+      <w:r>
+        <w:t xml:space="preserve">, </w:t>
+      </w:r>
+      <w:proofErr w:type="spellStart"/>
+      <w:r>
+        <w:t>canavar</w:t>
+      </w:r>
+      <w:proofErr w:type="spellEnd"/>
+      <w:r>
+        <w:t xml:space="preserve"> </w:t>
+      </w:r>
+      <w:proofErr w:type="spellStart"/>
+      <w:r>
+        <w:t>türleri</w:t>
+      </w:r>
+      <w:proofErr w:type="spellEnd"/>
+      <w:r>
+        <w:t xml:space="preserve">, </w:t>
+      </w:r>
+      <w:proofErr w:type="spellStart"/>
+      <w:r>
+        <w:t>ses</w:t>
+      </w:r>
+      <w:proofErr w:type="spellEnd"/>
+      <w:r>
+        <w:t xml:space="preserve"> </w:t>
+      </w:r>
+      <w:proofErr w:type="spellStart"/>
+      <w:r>
+        <w:t>efektleri</w:t>
+      </w:r>
+      <w:proofErr w:type="spellEnd"/>
     </w:p>
     <w:p>
       <w:pPr>
         <w:pStyle w:val="Heading2"/>
       </w:pPr>
-      <w:r>
-        <w:t>Geliştirme Fikirleri</w:t>
-      </w:r>
-    </w:p>
-    <w:p>
-      <w:r>
-        <w:t>- Mağaza, XP sistemi, yeni haritalar, canavar türleri, ses efektleri</w:t>
-      </w:r>
-    </w:p>
-    <w:p>
-      <w:pPr>
-        <w:pStyle w:val="Heading2"/>
-      </w:pPr>
-      <w:r>
-        <w:t>Geliştirme Yol Haritası</w:t>
-      </w:r>
+      <w:proofErr w:type="spellStart"/>
+      <w:r>
+        <w:t>Geliştirme</w:t>
+      </w:r>
+      <w:proofErr w:type="spellEnd"/>
+      <w:r>
+        <w:t xml:space="preserve"> Yol </w:t>
+      </w:r>
+      <w:proofErr w:type="spellStart"/>
+      <w:r>
+        <w:t>Haritası</w:t>
+      </w:r>
+      <w:proofErr w:type="spellEnd"/>
     </w:p>
     <w:p/>
     <w:p>
@@ -334,49 +1377,210 @@
     </w:p>
     <w:p>
       <w:r>
-        <w:t>- Oyun döngüsü oluşturuldu</w:t>
-      </w:r>
+        <w:t xml:space="preserve">- Oyun </w:t>
+      </w:r>
+      <w:proofErr w:type="spellStart"/>
+      <w:r>
+        <w:t>döngüsü</w:t>
+      </w:r>
+      <w:proofErr w:type="spellEnd"/>
+      <w:r>
+        <w:t xml:space="preserve"> </w:t>
+      </w:r>
+      <w:proofErr w:type="spellStart"/>
+      <w:r>
+        <w:t>oluşturuldu</w:t>
+      </w:r>
+      <w:proofErr w:type="spellEnd"/>
     </w:p>
     <w:p>
       <w:r>
-        <w:t>- Oyuncu ekranda gösterildi</w:t>
-      </w:r>
+        <w:t xml:space="preserve">- </w:t>
+      </w:r>
+      <w:proofErr w:type="spellStart"/>
+      <w:r>
+        <w:t>Oyuncu</w:t>
+      </w:r>
+      <w:proofErr w:type="spellEnd"/>
+      <w:r>
+        <w:t xml:space="preserve"> </w:t>
+      </w:r>
+      <w:proofErr w:type="spellStart"/>
+      <w:r>
+        <w:t>ekranda</w:t>
+      </w:r>
+      <w:proofErr w:type="spellEnd"/>
+      <w:r>
+        <w:t xml:space="preserve"> </w:t>
+      </w:r>
+      <w:proofErr w:type="spellStart"/>
+      <w:r>
+        <w:t>gösterildi</w:t>
+      </w:r>
+      <w:proofErr w:type="spellEnd"/>
     </w:p>
     <w:p>
       <w:r>
-        <w:t>- Oyuncu hareket ettirildi</w:t>
-      </w:r>
+        <w:t xml:space="preserve">- </w:t>
+      </w:r>
+      <w:proofErr w:type="spellStart"/>
+      <w:r>
+        <w:t>Oyuncu</w:t>
+      </w:r>
+      <w:proofErr w:type="spellEnd"/>
+      <w:r>
+        <w:t xml:space="preserve"> </w:t>
+      </w:r>
+      <w:proofErr w:type="spellStart"/>
+      <w:r>
+        <w:t>hareket</w:t>
+      </w:r>
+      <w:proofErr w:type="spellEnd"/>
+      <w:r>
+        <w:t xml:space="preserve"> </w:t>
+      </w:r>
+      <w:proofErr w:type="spellStart"/>
+      <w:r>
+        <w:t>ettirildi</w:t>
+      </w:r>
+      <w:proofErr w:type="spellEnd"/>
     </w:p>
     <w:p>
       <w:r>
-        <w:t>- Duvar ve objeler çizildi</w:t>
-      </w:r>
+        <w:t xml:space="preserve">- </w:t>
+      </w:r>
+      <w:proofErr w:type="spellStart"/>
+      <w:r>
+        <w:t>Duvar</w:t>
+      </w:r>
+      <w:proofErr w:type="spellEnd"/>
+      <w:r>
+        <w:t xml:space="preserve"> </w:t>
+      </w:r>
+      <w:proofErr w:type="spellStart"/>
+      <w:r>
+        <w:t>ve</w:t>
+      </w:r>
+      <w:proofErr w:type="spellEnd"/>
+      <w:r>
+        <w:t xml:space="preserve"> </w:t>
+      </w:r>
+      <w:proofErr w:type="spellStart"/>
+      <w:r>
+        <w:t>objeler</w:t>
+      </w:r>
+      <w:proofErr w:type="spellEnd"/>
+      <w:r>
+        <w:t xml:space="preserve"> </w:t>
+      </w:r>
+      <w:proofErr w:type="spellStart"/>
+      <w:r>
+        <w:t>çizildi</w:t>
+      </w:r>
+      <w:proofErr w:type="spellEnd"/>
     </w:p>
     <w:p>
       <w:r>
-        <w:t>- Temel oyun tamamlandı</w:t>
-      </w:r>
+        <w:t xml:space="preserve">- Temel </w:t>
+      </w:r>
+      <w:proofErr w:type="spellStart"/>
+      <w:r>
+        <w:t>oyun</w:t>
+      </w:r>
+      <w:proofErr w:type="spellEnd"/>
+      <w:r>
+        <w:t xml:space="preserve"> </w:t>
+      </w:r>
+      <w:proofErr w:type="spellStart"/>
+      <w:r>
+        <w:t>tamamlandı</w:t>
+      </w:r>
+      <w:proofErr w:type="spellEnd"/>
     </w:p>
     <w:p/>
     <w:p>
       <w:r>
-        <w:t>2. Aksiyon RPG</w:t>
+        <w:t xml:space="preserve">2. </w:t>
+      </w:r>
+      <w:proofErr w:type="spellStart"/>
+      <w:r>
+        <w:t>Aksiyon</w:t>
+      </w:r>
+      <w:proofErr w:type="spellEnd"/>
+      <w:r>
+        <w:t xml:space="preserve"> RPG</w:t>
       </w:r>
     </w:p>
     <w:p>
       <w:r>
-        <w:t>- Canavarlar eklendi</w:t>
-      </w:r>
+        <w:t xml:space="preserve">- </w:t>
+      </w:r>
+      <w:proofErr w:type="spellStart"/>
+      <w:r>
+        <w:t>Canavarlar</w:t>
+      </w:r>
+      <w:proofErr w:type="spellEnd"/>
+      <w:r>
+        <w:t xml:space="preserve"> </w:t>
+      </w:r>
+      <w:proofErr w:type="spellStart"/>
+      <w:r>
+        <w:t>eklendi</w:t>
+      </w:r>
+      <w:proofErr w:type="spellEnd"/>
     </w:p>
     <w:p>
       <w:r>
-        <w:t>- Savaş sistemi yapıldı</w:t>
-      </w:r>
+        <w:t xml:space="preserve">- Savaş </w:t>
+      </w:r>
+      <w:proofErr w:type="spellStart"/>
+      <w:r>
+        <w:t>sistemi</w:t>
+      </w:r>
+      <w:proofErr w:type="spellEnd"/>
+      <w:r>
+        <w:t xml:space="preserve"> </w:t>
+      </w:r>
+      <w:proofErr w:type="spellStart"/>
+      <w:r>
+        <w:t>yapıldı</w:t>
+      </w:r>
+      <w:proofErr w:type="spellEnd"/>
     </w:p>
     <w:p>
       <w:r>
-        <w:t>- Envanter sistemi entegre edildi</w:t>
-      </w:r>
+        <w:lastRenderedPageBreak/>
+        <w:t xml:space="preserve">- </w:t>
+      </w:r>
+      <w:proofErr w:type="spellStart"/>
+      <w:r>
+        <w:t>Envanter</w:t>
+      </w:r>
+      <w:proofErr w:type="spellEnd"/>
+      <w:r>
+        <w:t xml:space="preserve"> </w:t>
+      </w:r>
+      <w:proofErr w:type="spellStart"/>
+      <w:r>
+        <w:t>sistemi</w:t>
+      </w:r>
+      <w:proofErr w:type="spellEnd"/>
+      <w:r>
+        <w:t xml:space="preserve"> </w:t>
+      </w:r>
+      <w:proofErr w:type="spellStart"/>
+      <w:r>
+        <w:t>entegre</w:t>
+      </w:r>
+      <w:proofErr w:type="spellEnd"/>
+      <w:r>
+        <w:t xml:space="preserve"> </w:t>
+      </w:r>
+      <w:proofErr w:type="spellStart"/>
+      <w:r>
+        <w:t>edildi</w:t>
+      </w:r>
+      <w:proofErr w:type="spellEnd"/>
     </w:p>
     <w:p>
       <w:pPr>
@@ -397,13 +1601,28 @@
       <w:pPr>
         <w:pStyle w:val="Heading1"/>
       </w:pPr>
+      <w:proofErr w:type="spellStart"/>
       <w:r>
         <w:lastRenderedPageBreak/>
-        <w:t>Kod Dosyası</w:t>
-      </w:r>
-      <w:r>
-        <w:t xml:space="preserve"> Özet</w:t>
-      </w:r>
+        <w:t>Kod</w:t>
+      </w:r>
+      <w:proofErr w:type="spellEnd"/>
+      <w:r>
+        <w:t xml:space="preserve"> </w:t>
+      </w:r>
+      <w:proofErr w:type="spellStart"/>
+      <w:r>
+        <w:t>Dosyası</w:t>
+      </w:r>
+      <w:proofErr w:type="spellEnd"/>
+      <w:r>
+        <w:t xml:space="preserve"> </w:t>
+      </w:r>
+      <w:proofErr w:type="spellStart"/>
+      <w:r>
+        <w:t>Özet</w:t>
+      </w:r>
+      <w:proofErr w:type="spellEnd"/>
     </w:p>
     <w:p>
       <w:pPr>
@@ -415,13 +1634,103 @@
     </w:p>
     <w:p>
       <w:r>
-        <w:t>• JFrame başlatır ve GamePanel'i ekler</w:t>
-      </w:r>
+        <w:t xml:space="preserve">• </w:t>
+      </w:r>
+      <w:proofErr w:type="spellStart"/>
+      <w:r>
+        <w:t>JFrame</w:t>
+      </w:r>
+      <w:proofErr w:type="spellEnd"/>
+      <w:r>
+        <w:t xml:space="preserve"> </w:t>
+      </w:r>
+      <w:proofErr w:type="spellStart"/>
+      <w:r>
+        <w:t>başlatır</w:t>
+      </w:r>
+      <w:proofErr w:type="spellEnd"/>
+      <w:r>
+        <w:t xml:space="preserve"> </w:t>
+      </w:r>
+      <w:proofErr w:type="spellStart"/>
+      <w:r>
+        <w:t>ve</w:t>
+      </w:r>
+      <w:proofErr w:type="spellEnd"/>
+      <w:r>
+        <w:t xml:space="preserve"> </w:t>
+      </w:r>
+      <w:proofErr w:type="spellStart"/>
+      <w:r>
+        <w:t>GamePanel'i</w:t>
+      </w:r>
+      <w:proofErr w:type="spellEnd"/>
+      <w:r>
+        <w:t xml:space="preserve"> </w:t>
+      </w:r>
+      <w:proofErr w:type="spellStart"/>
+      <w:r>
+        <w:t>ekler</w:t>
+      </w:r>
+      <w:proofErr w:type="spellEnd"/>
     </w:p>
     <w:p>
       <w:r>
-        <w:t>• Pencere ayarlarını yapar ve oyun döngüsünü başlatır</w:t>
-      </w:r>
+        <w:t xml:space="preserve">• </w:t>
+      </w:r>
+      <w:proofErr w:type="spellStart"/>
+      <w:r>
+        <w:t>Pencere</w:t>
+      </w:r>
+      <w:proofErr w:type="spellEnd"/>
+      <w:r>
+        <w:t xml:space="preserve"> </w:t>
+      </w:r>
+      <w:proofErr w:type="spellStart"/>
+      <w:r>
+        <w:t>ayarlarını</w:t>
+      </w:r>
+      <w:proofErr w:type="spellEnd"/>
+      <w:r>
+        <w:t xml:space="preserve"> </w:t>
+      </w:r>
+      <w:proofErr w:type="spellStart"/>
+      <w:r>
+        <w:t>yapar</w:t>
+      </w:r>
+      <w:proofErr w:type="spellEnd"/>
+      <w:r>
+        <w:t xml:space="preserve"> </w:t>
+      </w:r>
+      <w:proofErr w:type="spellStart"/>
+      <w:r>
+        <w:t>ve</w:t>
+      </w:r>
+      <w:proofErr w:type="spellEnd"/>
+      <w:r>
+        <w:t xml:space="preserve"> </w:t>
+      </w:r>
+      <w:proofErr w:type="spellStart"/>
+      <w:r>
+        <w:t>oyun</w:t>
+      </w:r>
+      <w:proofErr w:type="spellEnd"/>
+      <w:r>
+        <w:t xml:space="preserve"> </w:t>
+      </w:r>
+      <w:proofErr w:type="spellStart"/>
+      <w:r>
+        <w:t>döngüsünü</w:t>
+      </w:r>
+      <w:proofErr w:type="spellEnd"/>
+      <w:r>
+        <w:t xml:space="preserve"> </w:t>
+      </w:r>
+      <w:proofErr w:type="spellStart"/>
+      <w:r>
+        <w:t>başlatır</w:t>
+      </w:r>
+      <w:proofErr w:type="spellEnd"/>
     </w:p>
     <w:p>
       <w:pPr>
@@ -433,18 +1742,113 @@
     </w:p>
     <w:p>
       <w:r>
-        <w:t>• Ekran ve tile boyutunu tanımlar</w:t>
-      </w:r>
+        <w:t xml:space="preserve">• </w:t>
+      </w:r>
+      <w:proofErr w:type="spellStart"/>
+      <w:r>
+        <w:t>Ekran</w:t>
+      </w:r>
+      <w:proofErr w:type="spellEnd"/>
+      <w:r>
+        <w:t xml:space="preserve"> </w:t>
+      </w:r>
+      <w:proofErr w:type="spellStart"/>
+      <w:r>
+        <w:t>ve</w:t>
+      </w:r>
+      <w:proofErr w:type="spellEnd"/>
+      <w:r>
+        <w:t xml:space="preserve"> tile </w:t>
+      </w:r>
+      <w:proofErr w:type="spellStart"/>
+      <w:r>
+        <w:t>boyutunu</w:t>
+      </w:r>
+      <w:proofErr w:type="spellEnd"/>
+      <w:r>
+        <w:t xml:space="preserve"> </w:t>
+      </w:r>
+      <w:proofErr w:type="spellStart"/>
+      <w:r>
+        <w:t>tanımlar</w:t>
+      </w:r>
+      <w:proofErr w:type="spellEnd"/>
     </w:p>
     <w:p>
       <w:r>
-        <w:t>• Oyun döngüsünü ve canavar respawn sistemini yönetir</w:t>
-      </w:r>
+        <w:t xml:space="preserve">• Oyun </w:t>
+      </w:r>
+      <w:proofErr w:type="spellStart"/>
+      <w:r>
+        <w:t>döngüsünü</w:t>
+      </w:r>
+      <w:proofErr w:type="spellEnd"/>
+      <w:r>
+        <w:t xml:space="preserve"> </w:t>
+      </w:r>
+      <w:proofErr w:type="spellStart"/>
+      <w:r>
+        <w:t>ve</w:t>
+      </w:r>
+      <w:proofErr w:type="spellEnd"/>
+      <w:r>
+        <w:t xml:space="preserve"> </w:t>
+      </w:r>
+      <w:proofErr w:type="spellStart"/>
+      <w:r>
+        <w:t>canavar</w:t>
+      </w:r>
+      <w:proofErr w:type="spellEnd"/>
+      <w:r>
+        <w:t xml:space="preserve"> respawn </w:t>
+      </w:r>
+      <w:proofErr w:type="spellStart"/>
+      <w:r>
+        <w:t>sistemini</w:t>
+      </w:r>
+      <w:proofErr w:type="spellEnd"/>
+      <w:r>
+        <w:t xml:space="preserve"> </w:t>
+      </w:r>
+      <w:proofErr w:type="spellStart"/>
+      <w:r>
+        <w:t>yönetir</w:t>
+      </w:r>
+      <w:proofErr w:type="spellEnd"/>
     </w:p>
     <w:p>
       <w:r>
-        <w:t>• Tüm oyun bileşenlerini çizer</w:t>
-      </w:r>
+        <w:t xml:space="preserve">• </w:t>
+      </w:r>
+      <w:proofErr w:type="spellStart"/>
+      <w:r>
+        <w:t>Tüm</w:t>
+      </w:r>
+      <w:proofErr w:type="spellEnd"/>
+      <w:r>
+        <w:t xml:space="preserve"> </w:t>
+      </w:r>
+      <w:proofErr w:type="spellStart"/>
+      <w:r>
+        <w:t>oyun</w:t>
+      </w:r>
+      <w:proofErr w:type="spellEnd"/>
+      <w:r>
+        <w:t xml:space="preserve"> </w:t>
+      </w:r>
+      <w:proofErr w:type="spellStart"/>
+      <w:r>
+        <w:t>bileşenlerini</w:t>
+      </w:r>
+      <w:proofErr w:type="spellEnd"/>
+      <w:r>
+        <w:t xml:space="preserve"> </w:t>
+      </w:r>
+      <w:proofErr w:type="spellStart"/>
+      <w:r>
+        <w:t>çizer</w:t>
+      </w:r>
+      <w:proofErr w:type="spellEnd"/>
     </w:p>
     <w:p>
       <w:pPr>
@@ -456,24 +1860,108 @@
     </w:p>
     <w:p>
       <w:r>
-        <w:t>• Canavar hareke</w:t>
-      </w:r>
-      <w:r>
-        <w:t>tlerini oluşturur</w:t>
-      </w:r>
+        <w:t xml:space="preserve">• </w:t>
+      </w:r>
+      <w:proofErr w:type="spellStart"/>
+      <w:r>
+        <w:t>Canavar</w:t>
+      </w:r>
+      <w:proofErr w:type="spellEnd"/>
+      <w:r>
+        <w:t xml:space="preserve"> </w:t>
+      </w:r>
+      <w:proofErr w:type="spellStart"/>
+      <w:r>
+        <w:t>hareke</w:t>
+      </w:r>
+      <w:r>
+        <w:t>tlerini</w:t>
+      </w:r>
+      <w:proofErr w:type="spellEnd"/>
+      <w:r>
+        <w:t xml:space="preserve"> </w:t>
+      </w:r>
+      <w:proofErr w:type="spellStart"/>
+      <w:r>
+        <w:t>oluşturur</w:t>
+      </w:r>
+      <w:proofErr w:type="spellEnd"/>
     </w:p>
     <w:p>
       <w:r>
-        <w:t>• Oyuncuya saldırır ve 20 saniye sonra yeniden doğar</w:t>
-      </w:r>
+        <w:t xml:space="preserve">• </w:t>
+      </w:r>
+      <w:proofErr w:type="spellStart"/>
+      <w:r>
+        <w:t>Oyuncuya</w:t>
+      </w:r>
+      <w:proofErr w:type="spellEnd"/>
+      <w:r>
+        <w:t xml:space="preserve"> </w:t>
+      </w:r>
+      <w:proofErr w:type="spellStart"/>
+      <w:r>
+        <w:t>saldırır</w:t>
+      </w:r>
+      <w:proofErr w:type="spellEnd"/>
+      <w:r>
+        <w:t xml:space="preserve"> </w:t>
+      </w:r>
+      <w:proofErr w:type="spellStart"/>
+      <w:r>
+        <w:t>ve</w:t>
+      </w:r>
+      <w:proofErr w:type="spellEnd"/>
+      <w:r>
+        <w:t xml:space="preserve"> 20 </w:t>
+      </w:r>
+      <w:proofErr w:type="spellStart"/>
+      <w:r>
+        <w:t>saniye</w:t>
+      </w:r>
+      <w:proofErr w:type="spellEnd"/>
+      <w:r>
+        <w:t xml:space="preserve"> </w:t>
+      </w:r>
+      <w:proofErr w:type="spellStart"/>
+      <w:r>
+        <w:t>sonra</w:t>
+      </w:r>
+      <w:proofErr w:type="spellEnd"/>
+      <w:r>
+        <w:t xml:space="preserve"> </w:t>
+      </w:r>
+      <w:proofErr w:type="spellStart"/>
+      <w:r>
+        <w:t>yeniden</w:t>
+      </w:r>
+      <w:proofErr w:type="spellEnd"/>
+      <w:r>
+        <w:t xml:space="preserve"> </w:t>
+      </w:r>
+      <w:proofErr w:type="spellStart"/>
+      <w:r>
+        <w:t>doğar</w:t>
+      </w:r>
+      <w:proofErr w:type="spellEnd"/>
     </w:p>
     <w:p>
       <w:r>
         <w:t xml:space="preserve">• </w:t>
       </w:r>
-      <w:r>
-        <w:t>Canavarı çizer</w:t>
-      </w:r>
+      <w:proofErr w:type="spellStart"/>
+      <w:r>
+        <w:t>Canavarı</w:t>
+      </w:r>
+      <w:proofErr w:type="spellEnd"/>
+      <w:r>
+        <w:t xml:space="preserve"> </w:t>
+      </w:r>
+      <w:proofErr w:type="spellStart"/>
+      <w:r>
+        <w:t>çizer</w:t>
+      </w:r>
+      <w:proofErr w:type="spellEnd"/>
     </w:p>
     <w:p>
       <w:pPr>
@@ -485,34 +1973,181 @@
     </w:p>
     <w:p>
       <w:r>
-        <w:t>• Oyuncunun hareketini ve çarpışmalarını yönetir</w:t>
-      </w:r>
+        <w:t xml:space="preserve">• </w:t>
+      </w:r>
+      <w:proofErr w:type="spellStart"/>
+      <w:r>
+        <w:t>Oyuncunun</w:t>
+      </w:r>
+      <w:proofErr w:type="spellEnd"/>
+      <w:r>
+        <w:t xml:space="preserve"> </w:t>
+      </w:r>
+      <w:proofErr w:type="spellStart"/>
+      <w:r>
+        <w:t>hareketini</w:t>
+      </w:r>
+      <w:proofErr w:type="spellEnd"/>
+      <w:r>
+        <w:t xml:space="preserve"> </w:t>
+      </w:r>
+      <w:proofErr w:type="spellStart"/>
+      <w:r>
+        <w:t>ve</w:t>
+      </w:r>
+      <w:proofErr w:type="spellEnd"/>
+      <w:r>
+        <w:t xml:space="preserve"> </w:t>
+      </w:r>
+      <w:proofErr w:type="spellStart"/>
+      <w:r>
+        <w:t>çarpışmalarını</w:t>
+      </w:r>
+      <w:proofErr w:type="spellEnd"/>
+      <w:r>
+        <w:t xml:space="preserve"> </w:t>
+      </w:r>
+      <w:proofErr w:type="spellStart"/>
+      <w:r>
+        <w:t>yönetir</w:t>
+      </w:r>
+      <w:proofErr w:type="spellEnd"/>
     </w:p>
     <w:p>
       <w:r>
-        <w:t>• Canavarlarla</w:t>
-      </w:r>
-      <w:r>
-        <w:t xml:space="preserve"> savaşır</w:t>
-      </w:r>
-      <w:r>
-        <w:t xml:space="preserve"> ve hasar görür</w:t>
-      </w:r>
+        <w:t xml:space="preserve">• </w:t>
+      </w:r>
+      <w:proofErr w:type="spellStart"/>
+      <w:r>
+        <w:t>Canavarlarla</w:t>
+      </w:r>
+      <w:proofErr w:type="spellEnd"/>
+      <w:r>
+        <w:t xml:space="preserve"> </w:t>
+      </w:r>
+      <w:proofErr w:type="spellStart"/>
+      <w:r>
+        <w:t>savaşır</w:t>
+      </w:r>
+      <w:proofErr w:type="spellEnd"/>
+      <w:r>
+        <w:t xml:space="preserve"> </w:t>
+      </w:r>
+      <w:proofErr w:type="spellStart"/>
+      <w:r>
+        <w:t>ve</w:t>
+      </w:r>
+      <w:proofErr w:type="spellEnd"/>
+      <w:r>
+        <w:t xml:space="preserve"> </w:t>
+      </w:r>
+      <w:proofErr w:type="spellStart"/>
+      <w:r>
+        <w:t>hasar</w:t>
+      </w:r>
+      <w:proofErr w:type="spellEnd"/>
+      <w:r>
+        <w:t xml:space="preserve"> </w:t>
+      </w:r>
+      <w:proofErr w:type="spellStart"/>
+      <w:r>
+        <w:t>görür</w:t>
+      </w:r>
+      <w:proofErr w:type="spellEnd"/>
     </w:p>
     <w:p>
       <w:r>
-        <w:t>• Her saniye HP yeniler</w:t>
-      </w:r>
+        <w:t xml:space="preserve">• Her </w:t>
+      </w:r>
+      <w:proofErr w:type="spellStart"/>
+      <w:r>
+        <w:t>saniye</w:t>
+      </w:r>
+      <w:proofErr w:type="spellEnd"/>
+      <w:r>
+        <w:t xml:space="preserve"> HP </w:t>
+      </w:r>
+      <w:proofErr w:type="spellStart"/>
+      <w:r>
+        <w:t>yeniler</w:t>
+      </w:r>
+      <w:proofErr w:type="spellEnd"/>
     </w:p>
     <w:p>
       <w:r>
-        <w:t>• Eşya kuşanma ve envanteri yönetir</w:t>
-      </w:r>
+        <w:t xml:space="preserve">• </w:t>
+      </w:r>
+      <w:proofErr w:type="spellStart"/>
+      <w:r>
+        <w:t>Eşya</w:t>
+      </w:r>
+      <w:proofErr w:type="spellEnd"/>
+      <w:r>
+        <w:t xml:space="preserve"> </w:t>
+      </w:r>
+      <w:proofErr w:type="spellStart"/>
+      <w:r>
+        <w:t>kuşanma</w:t>
+      </w:r>
+      <w:proofErr w:type="spellEnd"/>
+      <w:r>
+        <w:t xml:space="preserve"> </w:t>
+      </w:r>
+      <w:proofErr w:type="spellStart"/>
+      <w:r>
+        <w:t>ve</w:t>
+      </w:r>
+      <w:proofErr w:type="spellEnd"/>
+      <w:r>
+        <w:t xml:space="preserve"> </w:t>
+      </w:r>
+      <w:proofErr w:type="spellStart"/>
+      <w:r>
+        <w:t>envanteri</w:t>
+      </w:r>
+      <w:proofErr w:type="spellEnd"/>
+      <w:r>
+        <w:t xml:space="preserve"> </w:t>
+      </w:r>
+      <w:proofErr w:type="spellStart"/>
+      <w:r>
+        <w:t>yönetir</w:t>
+      </w:r>
+      <w:proofErr w:type="spellEnd"/>
     </w:p>
     <w:p>
       <w:r>
-        <w:t>• Oyuncuyu ve HP barını çizer</w:t>
-      </w:r>
+        <w:t xml:space="preserve">• </w:t>
+      </w:r>
+      <w:proofErr w:type="spellStart"/>
+      <w:r>
+        <w:t>Oyuncuyu</w:t>
+      </w:r>
+      <w:proofErr w:type="spellEnd"/>
+      <w:r>
+        <w:t xml:space="preserve"> </w:t>
+      </w:r>
+      <w:proofErr w:type="spellStart"/>
+      <w:r>
+        <w:t>ve</w:t>
+      </w:r>
+      <w:proofErr w:type="spellEnd"/>
+      <w:r>
+        <w:t xml:space="preserve"> HP </w:t>
+      </w:r>
+      <w:proofErr w:type="spellStart"/>
+      <w:r>
+        <w:t>barını</w:t>
+      </w:r>
+      <w:proofErr w:type="spellEnd"/>
+      <w:r>
+        <w:t xml:space="preserve"> </w:t>
+      </w:r>
+      <w:proofErr w:type="spellStart"/>
+      <w:r>
+        <w:t>çizer</w:t>
+      </w:r>
+      <w:proofErr w:type="spellEnd"/>
     </w:p>
     <w:p>
       <w:pPr>
@@ -524,18 +2159,116 @@
     </w:p>
     <w:p>
       <w:r>
-        <w:t>• map.txt dosyasını yükler ve çözümler</w:t>
-      </w:r>
+        <w:t xml:space="preserve">• map.txt </w:t>
+      </w:r>
+      <w:proofErr w:type="spellStart"/>
+      <w:r>
+        <w:t>dosyasını</w:t>
+      </w:r>
+      <w:proofErr w:type="spellEnd"/>
+      <w:r>
+        <w:t xml:space="preserve"> </w:t>
+      </w:r>
+      <w:proofErr w:type="spellStart"/>
+      <w:r>
+        <w:t>yükler</w:t>
+      </w:r>
+      <w:proofErr w:type="spellEnd"/>
+      <w:r>
+        <w:t xml:space="preserve"> </w:t>
+      </w:r>
+      <w:proofErr w:type="spellStart"/>
+      <w:r>
+        <w:t>ve</w:t>
+      </w:r>
+      <w:proofErr w:type="spellEnd"/>
+      <w:r>
+        <w:t xml:space="preserve"> </w:t>
+      </w:r>
+      <w:proofErr w:type="spellStart"/>
+      <w:r>
+        <w:t>çözümler</w:t>
+      </w:r>
+      <w:proofErr w:type="spellEnd"/>
     </w:p>
     <w:p>
       <w:r>
-        <w:t>• Tile türlerini eşleştirir (duvar, yol, başlangıç)</w:t>
+        <w:t xml:space="preserve">• Tile </w:t>
+      </w:r>
+      <w:proofErr w:type="spellStart"/>
+      <w:r>
+        <w:t>türlerini</w:t>
+      </w:r>
+      <w:proofErr w:type="spellEnd"/>
+      <w:r>
+        <w:t xml:space="preserve"> </w:t>
+      </w:r>
+      <w:proofErr w:type="spellStart"/>
+      <w:r>
+        <w:t>eşleştirir</w:t>
+      </w:r>
+      <w:proofErr w:type="spellEnd"/>
+      <w:r>
+        <w:t xml:space="preserve"> (</w:t>
+      </w:r>
+      <w:proofErr w:type="spellStart"/>
+      <w:r>
+        <w:t>duvar</w:t>
+      </w:r>
+      <w:proofErr w:type="spellEnd"/>
+      <w:r>
+        <w:t xml:space="preserve">, </w:t>
+      </w:r>
+      <w:proofErr w:type="spellStart"/>
+      <w:r>
+        <w:t>yol</w:t>
+      </w:r>
+      <w:proofErr w:type="spellEnd"/>
+      <w:r>
+        <w:t xml:space="preserve">, </w:t>
+      </w:r>
+      <w:proofErr w:type="spellStart"/>
+      <w:r>
+        <w:t>başlangıç</w:t>
+      </w:r>
+      <w:proofErr w:type="spellEnd"/>
+      <w:r>
+        <w:t>)</w:t>
       </w:r>
     </w:p>
     <w:p>
       <w:r>
-        <w:t>• Arka plan ve duvar sembollerini çizer</w:t>
-      </w:r>
+        <w:t xml:space="preserve">• Arka plan </w:t>
+      </w:r>
+      <w:proofErr w:type="spellStart"/>
+      <w:r>
+        <w:t>ve</w:t>
+      </w:r>
+      <w:proofErr w:type="spellEnd"/>
+      <w:r>
+        <w:t xml:space="preserve"> </w:t>
+      </w:r>
+      <w:proofErr w:type="spellStart"/>
+      <w:r>
+        <w:t>duvar</w:t>
+      </w:r>
+      <w:proofErr w:type="spellEnd"/>
+      <w:r>
+        <w:t xml:space="preserve"> </w:t>
+      </w:r>
+      <w:proofErr w:type="spellStart"/>
+      <w:r>
+        <w:t>sembollerini</w:t>
+      </w:r>
+      <w:proofErr w:type="spellEnd"/>
+      <w:r>
+        <w:t xml:space="preserve"> </w:t>
+      </w:r>
+      <w:proofErr w:type="spellStart"/>
+      <w:r>
+        <w:t>çizer</w:t>
+      </w:r>
+      <w:proofErr w:type="spellEnd"/>
     </w:p>
     <w:p>
       <w:pPr>
@@ -547,19 +2280,74 @@
     </w:p>
     <w:p>
       <w:r>
-        <w:t>• Haritadak</w:t>
-      </w:r>
-      <w:r>
-        <w:t>i duvarı kontrol eder</w:t>
-      </w:r>
+        <w:t xml:space="preserve">• </w:t>
+      </w:r>
+      <w:proofErr w:type="spellStart"/>
+      <w:r>
+        <w:t>Haritadak</w:t>
+      </w:r>
+      <w:r>
+        <w:t>i</w:t>
+      </w:r>
+      <w:proofErr w:type="spellEnd"/>
+      <w:r>
+        <w:t xml:space="preserve"> </w:t>
+      </w:r>
+      <w:proofErr w:type="spellStart"/>
+      <w:r>
+        <w:t>duvarı</w:t>
+      </w:r>
+      <w:proofErr w:type="spellEnd"/>
+      <w:r>
+        <w:t xml:space="preserve"> </w:t>
+      </w:r>
+      <w:proofErr w:type="spellStart"/>
+      <w:r>
+        <w:t>kontrol</w:t>
+      </w:r>
+      <w:proofErr w:type="spellEnd"/>
+      <w:r>
+        <w:t xml:space="preserve"> </w:t>
+      </w:r>
+      <w:proofErr w:type="spellStart"/>
+      <w:r>
+        <w:t>eder</w:t>
+      </w:r>
+      <w:proofErr w:type="spellEnd"/>
     </w:p>
     <w:p>
       <w:r>
-        <w:t xml:space="preserve">• Görsel </w:t>
-      </w:r>
-      <w:r>
-        <w:t>bilgisini buradan alabilir</w:t>
-      </w:r>
+        <w:t xml:space="preserve">• </w:t>
+      </w:r>
+      <w:proofErr w:type="spellStart"/>
+      <w:r>
+        <w:t>Görsel</w:t>
+      </w:r>
+      <w:proofErr w:type="spellEnd"/>
+      <w:r>
+        <w:t xml:space="preserve"> </w:t>
+      </w:r>
+      <w:proofErr w:type="spellStart"/>
+      <w:r>
+        <w:t>bilgisini</w:t>
+      </w:r>
+      <w:proofErr w:type="spellEnd"/>
+      <w:r>
+        <w:t xml:space="preserve"> </w:t>
+      </w:r>
+      <w:proofErr w:type="spellStart"/>
+      <w:r>
+        <w:t>buradan</w:t>
+      </w:r>
+      <w:proofErr w:type="spellEnd"/>
+      <w:r>
+        <w:t xml:space="preserve"> </w:t>
+      </w:r>
+      <w:proofErr w:type="spellStart"/>
+      <w:r>
+        <w:t>alabilir</w:t>
+      </w:r>
+      <w:proofErr w:type="spellEnd"/>
     </w:p>
     <w:p>
       <w:pPr>
@@ -571,12 +2359,89 @@
     </w:p>
     <w:p>
       <w:r>
-        <w:t>• Klavye tuşlarını dinler</w:t>
-      </w:r>
+        <w:t xml:space="preserve">• </w:t>
+      </w:r>
+      <w:proofErr w:type="spellStart"/>
+      <w:r>
+        <w:t>Klavye</w:t>
+      </w:r>
+      <w:proofErr w:type="spellEnd"/>
+      <w:r>
+        <w:t xml:space="preserve"> </w:t>
+      </w:r>
+      <w:proofErr w:type="spellStart"/>
+      <w:r>
+        <w:t>tuşlarını</w:t>
+      </w:r>
+      <w:proofErr w:type="spellEnd"/>
+      <w:r>
+        <w:t xml:space="preserve"> </w:t>
+      </w:r>
+      <w:proofErr w:type="spellStart"/>
+      <w:r>
+        <w:t>dinler</w:t>
+      </w:r>
+      <w:proofErr w:type="spellEnd"/>
     </w:p>
     <w:p>
       <w:r>
-        <w:t>• Hareketi ve oyun içi etkileşimleri kontrol eder (I, Q, E, Y/N)</w:t>
+        <w:t xml:space="preserve">• </w:t>
+      </w:r>
+      <w:proofErr w:type="spellStart"/>
+      <w:r>
+        <w:t>Hareketi</w:t>
+      </w:r>
+      <w:proofErr w:type="spellEnd"/>
+      <w:r>
+        <w:t xml:space="preserve"> </w:t>
+      </w:r>
+      <w:proofErr w:type="spellStart"/>
+      <w:r>
+        <w:t>ve</w:t>
+      </w:r>
+      <w:proofErr w:type="spellEnd"/>
+      <w:r>
+        <w:t xml:space="preserve"> </w:t>
+      </w:r>
+      <w:proofErr w:type="spellStart"/>
+      <w:r>
+        <w:t>oyun</w:t>
+      </w:r>
+      <w:proofErr w:type="spellEnd"/>
+      <w:r>
+        <w:t xml:space="preserve"> </w:t>
+      </w:r>
+      <w:proofErr w:type="spellStart"/>
+      <w:r>
+        <w:t>içi</w:t>
+      </w:r>
+      <w:proofErr w:type="spellEnd"/>
+      <w:r>
+        <w:t xml:space="preserve"> </w:t>
+      </w:r>
+      <w:proofErr w:type="spellStart"/>
+      <w:r>
+        <w:t>etkileşimleri</w:t>
+      </w:r>
+      <w:proofErr w:type="spellEnd"/>
+      <w:r>
+        <w:t xml:space="preserve"> </w:t>
+      </w:r>
+      <w:proofErr w:type="spellStart"/>
+      <w:r>
+        <w:t>kontrol</w:t>
+      </w:r>
+      <w:proofErr w:type="spellEnd"/>
+      <w:r>
+        <w:t xml:space="preserve"> </w:t>
+      </w:r>
+      <w:proofErr w:type="spellStart"/>
+      <w:r>
+        <w:t>eder</w:t>
+      </w:r>
+      <w:proofErr w:type="spellEnd"/>
+      <w:r>
+        <w:t xml:space="preserve"> (I, Q, E, Y/N)</w:t>
       </w:r>
       <w:r>
         <w:br w:type="page"/>
@@ -616,13 +2481,106 @@
     </w:p>
     <w:p>
       <w:r>
-        <w:t>• Bir eşyayı temsil eder (Kılıç veya Ayakkabı)</w:t>
+        <w:t xml:space="preserve">• Bir </w:t>
+      </w:r>
+      <w:proofErr w:type="spellStart"/>
+      <w:r>
+        <w:t>eşyayı</w:t>
+      </w:r>
+      <w:proofErr w:type="spellEnd"/>
+      <w:r>
+        <w:t xml:space="preserve"> </w:t>
+      </w:r>
+      <w:proofErr w:type="spellStart"/>
+      <w:r>
+        <w:t>temsil</w:t>
+      </w:r>
+      <w:proofErr w:type="spellEnd"/>
+      <w:r>
+        <w:t xml:space="preserve"> </w:t>
+      </w:r>
+      <w:proofErr w:type="spellStart"/>
+      <w:r>
+        <w:t>eder</w:t>
+      </w:r>
+      <w:proofErr w:type="spellEnd"/>
+      <w:r>
+        <w:t xml:space="preserve"> (Kılıç </w:t>
+      </w:r>
+      <w:proofErr w:type="spellStart"/>
+      <w:r>
+        <w:t>veya</w:t>
+      </w:r>
+      <w:proofErr w:type="spellEnd"/>
+      <w:r>
+        <w:t xml:space="preserve"> </w:t>
+      </w:r>
+      <w:proofErr w:type="spellStart"/>
+      <w:r>
+        <w:t>Ayakkabı</w:t>
+      </w:r>
+      <w:proofErr w:type="spellEnd"/>
+      <w:r>
+        <w:t>)</w:t>
       </w:r>
     </w:p>
     <w:p>
       <w:r>
-        <w:t>• İsim, tür, değer ve satış fiyatını içerir</w:t>
-      </w:r>
+        <w:t xml:space="preserve">• </w:t>
+      </w:r>
+      <w:proofErr w:type="spellStart"/>
+      <w:r>
+        <w:t>İsim</w:t>
+      </w:r>
+      <w:proofErr w:type="spellEnd"/>
+      <w:r>
+        <w:t xml:space="preserve">, </w:t>
+      </w:r>
+      <w:proofErr w:type="spellStart"/>
+      <w:r>
+        <w:t>tür</w:t>
+      </w:r>
+      <w:proofErr w:type="spellEnd"/>
+      <w:r>
+        <w:t xml:space="preserve">, </w:t>
+      </w:r>
+      <w:proofErr w:type="spellStart"/>
+      <w:r>
+        <w:t>değer</w:t>
+      </w:r>
+      <w:proofErr w:type="spellEnd"/>
+      <w:r>
+        <w:t xml:space="preserve"> </w:t>
+      </w:r>
+      <w:proofErr w:type="spellStart"/>
+      <w:r>
+        <w:t>ve</w:t>
+      </w:r>
+      <w:proofErr w:type="spellEnd"/>
+      <w:r>
+        <w:t xml:space="preserve"> </w:t>
+      </w:r>
+      <w:proofErr w:type="spellStart"/>
+      <w:r>
+        <w:t>satış</w:t>
+      </w:r>
+      <w:proofErr w:type="spellEnd"/>
+      <w:r>
+        <w:t xml:space="preserve"> </w:t>
+      </w:r>
+      <w:proofErr w:type="spellStart"/>
+      <w:r>
+        <w:t>fiyatını</w:t>
+      </w:r>
+      <w:proofErr w:type="spellEnd"/>
+      <w:r>
+        <w:t xml:space="preserve"> </w:t>
+      </w:r>
+      <w:proofErr w:type="spellStart"/>
+      <w:r>
+        <w:t>içerir</w:t>
+      </w:r>
+      <w:proofErr w:type="spellEnd"/>
     </w:p>
     <w:p>
       <w:pPr>
@@ -634,13 +2592,71 @@
     </w:p>
     <w:p>
       <w:r>
-        <w:t>• Veritabanında oyuncu durumunu tutan JPA entity sınıfı</w:t>
-      </w:r>
+        <w:t xml:space="preserve">• </w:t>
+      </w:r>
+      <w:proofErr w:type="spellStart"/>
+      <w:r>
+        <w:t>Veritabanında</w:t>
+      </w:r>
+      <w:proofErr w:type="spellEnd"/>
+      <w:r>
+        <w:t xml:space="preserve"> </w:t>
+      </w:r>
+      <w:proofErr w:type="spellStart"/>
+      <w:r>
+        <w:t>oyuncu</w:t>
+      </w:r>
+      <w:proofErr w:type="spellEnd"/>
+      <w:r>
+        <w:t xml:space="preserve"> </w:t>
+      </w:r>
+      <w:proofErr w:type="spellStart"/>
+      <w:r>
+        <w:t>durumunu</w:t>
+      </w:r>
+      <w:proofErr w:type="spellEnd"/>
+      <w:r>
+        <w:t xml:space="preserve"> </w:t>
+      </w:r>
+      <w:proofErr w:type="spellStart"/>
+      <w:r>
+        <w:t>tutan</w:t>
+      </w:r>
+      <w:proofErr w:type="spellEnd"/>
+      <w:r>
+        <w:t xml:space="preserve"> JPA entity </w:t>
+      </w:r>
+      <w:proofErr w:type="spellStart"/>
+      <w:r>
+        <w:t>sınıfı</w:t>
+      </w:r>
+      <w:proofErr w:type="spellEnd"/>
     </w:p>
     <w:p>
       <w:r>
-        <w:t>• Alanlar: coins, level, currentHp, maxHp</w:t>
-      </w:r>
+        <w:t xml:space="preserve">• </w:t>
+      </w:r>
+      <w:proofErr w:type="spellStart"/>
+      <w:r>
+        <w:t>Alanlar</w:t>
+      </w:r>
+      <w:proofErr w:type="spellEnd"/>
+      <w:r>
+        <w:t xml:space="preserve">: coins, level, </w:t>
+      </w:r>
+      <w:proofErr w:type="spellStart"/>
+      <w:r>
+        <w:t>currentHp</w:t>
+      </w:r>
+      <w:proofErr w:type="spellEnd"/>
+      <w:r>
+        <w:t xml:space="preserve">, </w:t>
+      </w:r>
+      <w:proofErr w:type="spellStart"/>
+      <w:r>
+        <w:t>maxHp</w:t>
+      </w:r>
+      <w:proofErr w:type="spellEnd"/>
     </w:p>
     <w:p>
       <w:pPr>
@@ -652,12 +2668,81 @@
     </w:p>
     <w:p>
       <w:r>
-        <w:t>• Rastgele eşya üretim mantığını içerir</w:t>
-      </w:r>
+        <w:t xml:space="preserve">• </w:t>
+      </w:r>
+      <w:proofErr w:type="spellStart"/>
+      <w:r>
+        <w:t>Rastgele</w:t>
+      </w:r>
+      <w:proofErr w:type="spellEnd"/>
+      <w:r>
+        <w:t xml:space="preserve"> </w:t>
+      </w:r>
+      <w:proofErr w:type="spellStart"/>
+      <w:r>
+        <w:t>eşya</w:t>
+      </w:r>
+      <w:proofErr w:type="spellEnd"/>
+      <w:r>
+        <w:t xml:space="preserve"> </w:t>
+      </w:r>
+      <w:proofErr w:type="spellStart"/>
+      <w:r>
+        <w:t>üretim</w:t>
+      </w:r>
+      <w:proofErr w:type="spellEnd"/>
+      <w:r>
+        <w:t xml:space="preserve"> </w:t>
+      </w:r>
+      <w:proofErr w:type="spellStart"/>
+      <w:r>
+        <w:t>mantığını</w:t>
+      </w:r>
+      <w:proofErr w:type="spellEnd"/>
+      <w:r>
+        <w:t xml:space="preserve"> </w:t>
+      </w:r>
+      <w:proofErr w:type="spellStart"/>
+      <w:r>
+        <w:t>içerir</w:t>
+      </w:r>
+      <w:proofErr w:type="spellEnd"/>
     </w:p>
     <w:p>
       <w:r>
-        <w:t>• Loot ya da tüm mevcut eşyaları döner</w:t>
+        <w:t xml:space="preserve">• Loot </w:t>
+      </w:r>
+      <w:proofErr w:type="spellStart"/>
+      <w:r>
+        <w:t>ya</w:t>
+      </w:r>
+      <w:proofErr w:type="spellEnd"/>
+      <w:r>
+        <w:t xml:space="preserve"> da </w:t>
+      </w:r>
+      <w:proofErr w:type="spellStart"/>
+      <w:r>
+        <w:t>tüm</w:t>
+      </w:r>
+      <w:proofErr w:type="spellEnd"/>
+      <w:r>
+        <w:t xml:space="preserve"> </w:t>
+      </w:r>
+      <w:proofErr w:type="spellStart"/>
+      <w:r>
+        <w:t>mevcut</w:t>
+      </w:r>
+      <w:proofErr w:type="spellEnd"/>
+      <w:r>
+        <w:t xml:space="preserve"> </w:t>
+      </w:r>
+      <w:proofErr w:type="spellStart"/>
+      <w:r>
+        <w:t>eşyaları</w:t>
+      </w:r>
+      <w:proofErr w:type="spellEnd"/>
+      <w:r>
+        <w:t xml:space="preserve"> döner</w:t>
       </w:r>
     </w:p>
     <w:p>
@@ -670,17 +2755,115 @@
     </w:p>
     <w:p>
       <w:r>
-        <w:t>• Oyun ile veritabanı arasındaki bağlantıyı yönetir</w:t>
-      </w:r>
+        <w:t xml:space="preserve">• Oyun </w:t>
+      </w:r>
+      <w:proofErr w:type="spellStart"/>
+      <w:r>
+        <w:t>ile</w:t>
+      </w:r>
+      <w:proofErr w:type="spellEnd"/>
+      <w:r>
+        <w:t xml:space="preserve"> </w:t>
+      </w:r>
+      <w:proofErr w:type="spellStart"/>
+      <w:r>
+        <w:t>veritabanı</w:t>
+      </w:r>
+      <w:proofErr w:type="spellEnd"/>
+      <w:r>
+        <w:t xml:space="preserve"> </w:t>
+      </w:r>
+      <w:proofErr w:type="spellStart"/>
+      <w:r>
+        <w:t>arasındaki</w:t>
+      </w:r>
+      <w:proofErr w:type="spellEnd"/>
+      <w:r>
+        <w:t xml:space="preserve"> </w:t>
+      </w:r>
+      <w:proofErr w:type="spellStart"/>
+      <w:r>
+        <w:t>bağlantıyı</w:t>
+      </w:r>
+      <w:proofErr w:type="spellEnd"/>
+      <w:r>
+        <w:t xml:space="preserve"> </w:t>
+      </w:r>
+      <w:proofErr w:type="spellStart"/>
+      <w:r>
+        <w:t>yönetir</w:t>
+      </w:r>
+      <w:proofErr w:type="spellEnd"/>
     </w:p>
     <w:p>
       <w:r>
-        <w:t>• PlayerEntity'yi alır veya kaydeder</w:t>
-      </w:r>
+        <w:t xml:space="preserve">• </w:t>
+      </w:r>
+      <w:proofErr w:type="spellStart"/>
+      <w:r>
+        <w:t>PlayerEntity'yi</w:t>
+      </w:r>
+      <w:proofErr w:type="spellEnd"/>
+      <w:r>
+        <w:t xml:space="preserve"> </w:t>
+      </w:r>
+      <w:proofErr w:type="spellStart"/>
+      <w:r>
+        <w:t>alır</w:t>
+      </w:r>
+      <w:proofErr w:type="spellEnd"/>
+      <w:r>
+        <w:t xml:space="preserve"> </w:t>
+      </w:r>
+      <w:proofErr w:type="spellStart"/>
+      <w:r>
+        <w:t>veya</w:t>
+      </w:r>
+      <w:proofErr w:type="spellEnd"/>
+      <w:r>
+        <w:t xml:space="preserve"> </w:t>
+      </w:r>
+      <w:proofErr w:type="spellStart"/>
+      <w:r>
+        <w:t>kaydeder</w:t>
+      </w:r>
+      <w:proofErr w:type="spellEnd"/>
     </w:p>
     <w:p>
       <w:r>
-        <w:t>• Canlı oyun içindeki Player nesnesini döner</w:t>
+        <w:t xml:space="preserve">• </w:t>
+      </w:r>
+      <w:proofErr w:type="spellStart"/>
+      <w:r>
+        <w:t>Canlı</w:t>
+      </w:r>
+      <w:proofErr w:type="spellEnd"/>
+      <w:r>
+        <w:t xml:space="preserve"> </w:t>
+      </w:r>
+      <w:proofErr w:type="spellStart"/>
+      <w:r>
+        <w:t>oyun</w:t>
+      </w:r>
+      <w:proofErr w:type="spellEnd"/>
+      <w:r>
+        <w:t xml:space="preserve"> </w:t>
+      </w:r>
+      <w:proofErr w:type="spellStart"/>
+      <w:r>
+        <w:t>içindeki</w:t>
+      </w:r>
+      <w:proofErr w:type="spellEnd"/>
+      <w:r>
+        <w:t xml:space="preserve"> Player </w:t>
+      </w:r>
+      <w:proofErr w:type="spellStart"/>
+      <w:r>
+        <w:t>nesnesini</w:t>
+      </w:r>
+      <w:proofErr w:type="spellEnd"/>
+      <w:r>
+        <w:t xml:space="preserve"> döner</w:t>
       </w:r>
     </w:p>
     <w:p>
@@ -693,12 +2876,65 @@
     </w:p>
     <w:p>
       <w:r>
-        <w:t>• Eşyaları almak için REST endpoint'leri sunar</w:t>
-      </w:r>
+        <w:t xml:space="preserve">• </w:t>
+      </w:r>
+      <w:proofErr w:type="spellStart"/>
+      <w:r>
+        <w:t>Eşyaları</w:t>
+      </w:r>
+      <w:proofErr w:type="spellEnd"/>
+      <w:r>
+        <w:t xml:space="preserve"> </w:t>
+      </w:r>
+      <w:proofErr w:type="spellStart"/>
+      <w:r>
+        <w:t>almak</w:t>
+      </w:r>
+      <w:proofErr w:type="spellEnd"/>
+      <w:r>
+        <w:t xml:space="preserve"> </w:t>
+      </w:r>
+      <w:proofErr w:type="spellStart"/>
+      <w:r>
+        <w:t>için</w:t>
+      </w:r>
+      <w:proofErr w:type="spellEnd"/>
+      <w:r>
+        <w:t xml:space="preserve"> REST </w:t>
+      </w:r>
+      <w:proofErr w:type="spellStart"/>
+      <w:r>
+        <w:t>endpoint'leri</w:t>
+      </w:r>
+      <w:proofErr w:type="spellEnd"/>
+      <w:r>
+        <w:t xml:space="preserve"> </w:t>
+      </w:r>
+      <w:proofErr w:type="spellStart"/>
+      <w:r>
+        <w:t>sunar</w:t>
+      </w:r>
+      <w:proofErr w:type="spellEnd"/>
     </w:p>
     <w:p>
       <w:r>
-        <w:t>• GET /api/items/random, /api/items</w:t>
+        <w:t>• GET /</w:t>
+      </w:r>
+      <w:proofErr w:type="spellStart"/>
+      <w:r>
+        <w:t>api</w:t>
+      </w:r>
+      <w:proofErr w:type="spellEnd"/>
+      <w:r>
+        <w:t>/items/random, /</w:t>
+      </w:r>
+      <w:proofErr w:type="spellStart"/>
+      <w:r>
+        <w:t>api</w:t>
+      </w:r>
+      <w:proofErr w:type="spellEnd"/>
+      <w:r>
+        <w:t>/items</w:t>
       </w:r>
     </w:p>
     <w:p>
@@ -711,17 +2947,94 @@
     </w:p>
     <w:p>
       <w:r>
-        <w:t>• Oyuncu bilgilerini almak veya güncellemek için REST endpoint'leri sağlar</w:t>
-      </w:r>
+        <w:t xml:space="preserve">• </w:t>
+      </w:r>
+      <w:proofErr w:type="spellStart"/>
+      <w:r>
+        <w:t>Oyuncu</w:t>
+      </w:r>
+      <w:proofErr w:type="spellEnd"/>
+      <w:r>
+        <w:t xml:space="preserve"> </w:t>
+      </w:r>
+      <w:proofErr w:type="spellStart"/>
+      <w:r>
+        <w:t>bilgilerini</w:t>
+      </w:r>
+      <w:proofErr w:type="spellEnd"/>
+      <w:r>
+        <w:t xml:space="preserve"> </w:t>
+      </w:r>
+      <w:proofErr w:type="spellStart"/>
+      <w:r>
+        <w:t>almak</w:t>
+      </w:r>
+      <w:proofErr w:type="spellEnd"/>
+      <w:r>
+        <w:t xml:space="preserve"> </w:t>
+      </w:r>
+      <w:proofErr w:type="spellStart"/>
+      <w:r>
+        <w:t>veya</w:t>
+      </w:r>
+      <w:proofErr w:type="spellEnd"/>
+      <w:r>
+        <w:t xml:space="preserve"> </w:t>
+      </w:r>
+      <w:proofErr w:type="spellStart"/>
+      <w:r>
+        <w:t>güncellemek</w:t>
+      </w:r>
+      <w:proofErr w:type="spellEnd"/>
+      <w:r>
+        <w:t xml:space="preserve"> </w:t>
+      </w:r>
+      <w:proofErr w:type="spellStart"/>
+      <w:r>
+        <w:t>için</w:t>
+      </w:r>
+      <w:proofErr w:type="spellEnd"/>
+      <w:r>
+        <w:t xml:space="preserve"> REST </w:t>
+      </w:r>
+      <w:proofErr w:type="spellStart"/>
+      <w:r>
+        <w:t>endpoint'leri</w:t>
+      </w:r>
+      <w:proofErr w:type="spellEnd"/>
+      <w:r>
+        <w:t xml:space="preserve"> </w:t>
+      </w:r>
+      <w:proofErr w:type="spellStart"/>
+      <w:r>
+        <w:t>sağlar</w:t>
+      </w:r>
+      <w:proofErr w:type="spellEnd"/>
     </w:p>
     <w:p>
       <w:r>
-        <w:t>• GET /api/player/coins, inventory, summary, vs.</w:t>
+        <w:t>• GET /</w:t>
+      </w:r>
+      <w:proofErr w:type="spellStart"/>
+      <w:r>
+        <w:t>api</w:t>
+      </w:r>
+      <w:proofErr w:type="spellEnd"/>
+      <w:r>
+        <w:t>/player/coins, inventory, summary, vs.</w:t>
       </w:r>
     </w:p>
     <w:p>
       <w:r>
-        <w:t>• POST /api/player/save</w:t>
+        <w:t>• POST /</w:t>
+      </w:r>
+      <w:proofErr w:type="spellStart"/>
+      <w:r>
+        <w:t>api</w:t>
+      </w:r>
+      <w:proofErr w:type="spellEnd"/>
+      <w:r>
+        <w:t>/player/save</w:t>
       </w:r>
     </w:p>
     <w:p/>
@@ -730,10 +3043,7 @@
         <w:pStyle w:val="Heading2"/>
       </w:pPr>
       <w:r>
-        <w:t>PlayerRepository</w:t>
-      </w:r>
-      <w:r>
-        <w:t>.java</w:t>
+        <w:t>PlayerRepository.java</w:t>
       </w:r>
     </w:p>
     <w:p>
@@ -839,10 +3149,7 @@
         </w:rPr>
       </w:pPr>
       <w:r>
-        <w:t>•</w:t>
-      </w:r>
-      <w:r>
-        <w:t xml:space="preserve"> </w:t>
+        <w:t xml:space="preserve">• </w:t>
       </w:r>
       <w:r>
         <w:rPr>
@@ -857,35 +3164,246 @@
       <w:pPr>
         <w:pStyle w:val="Heading2"/>
       </w:pPr>
+      <w:proofErr w:type="spellStart"/>
       <w:r>
         <w:lastRenderedPageBreak/>
-        <w:t>Yaşanmış Sorunlar</w:t>
-      </w:r>
+        <w:t>Yaşanmış</w:t>
+      </w:r>
+      <w:proofErr w:type="spellEnd"/>
+      <w:r>
+        <w:t xml:space="preserve"> </w:t>
+      </w:r>
+      <w:proofErr w:type="spellStart"/>
+      <w:r>
+        <w:t>Sorunlar</w:t>
+      </w:r>
+      <w:proofErr w:type="spellEnd"/>
     </w:p>
     <w:p>
       <w:r>
-        <w:t>• Oyuncu duvarlardan geçebiliyordu, futureArea ile çözüldü</w:t>
-      </w:r>
+        <w:t xml:space="preserve">• </w:t>
+      </w:r>
+      <w:proofErr w:type="spellStart"/>
+      <w:r>
+        <w:t>Oyuncu</w:t>
+      </w:r>
+      <w:proofErr w:type="spellEnd"/>
+      <w:r>
+        <w:t xml:space="preserve"> </w:t>
+      </w:r>
+      <w:proofErr w:type="spellStart"/>
+      <w:r>
+        <w:t>duvarlardan</w:t>
+      </w:r>
+      <w:proofErr w:type="spellEnd"/>
+      <w:r>
+        <w:t xml:space="preserve"> </w:t>
+      </w:r>
+      <w:proofErr w:type="spellStart"/>
+      <w:r>
+        <w:t>geçebiliyordu</w:t>
+      </w:r>
+      <w:proofErr w:type="spellEnd"/>
+      <w:r>
+        <w:t xml:space="preserve">, </w:t>
+      </w:r>
+      <w:proofErr w:type="spellStart"/>
+      <w:r>
+        <w:t>futureArea</w:t>
+      </w:r>
+      <w:proofErr w:type="spellEnd"/>
+      <w:r>
+        <w:t xml:space="preserve"> </w:t>
+      </w:r>
+      <w:proofErr w:type="spellStart"/>
+      <w:r>
+        <w:t>ile</w:t>
+      </w:r>
+      <w:proofErr w:type="spellEnd"/>
+      <w:r>
+        <w:t xml:space="preserve"> </w:t>
+      </w:r>
+      <w:proofErr w:type="spellStart"/>
+      <w:r>
+        <w:t>çözüldü</w:t>
+      </w:r>
+      <w:proofErr w:type="spellEnd"/>
     </w:p>
     <w:p>
       <w:r>
-        <w:t>• Hız arttıkça bug oluşuyordu, 1 px’lik adımlarla çözüldü</w:t>
-      </w:r>
+        <w:t xml:space="preserve">• </w:t>
+      </w:r>
+      <w:proofErr w:type="spellStart"/>
+      <w:r>
+        <w:t>Hız</w:t>
+      </w:r>
+      <w:proofErr w:type="spellEnd"/>
+      <w:r>
+        <w:t xml:space="preserve"> </w:t>
+      </w:r>
+      <w:proofErr w:type="spellStart"/>
+      <w:r>
+        <w:t>arttıkça</w:t>
+      </w:r>
+      <w:proofErr w:type="spellEnd"/>
+      <w:r>
+        <w:t xml:space="preserve"> bug </w:t>
+      </w:r>
+      <w:proofErr w:type="spellStart"/>
+      <w:r>
+        <w:t>oluşuyordu</w:t>
+      </w:r>
+      <w:proofErr w:type="spellEnd"/>
+      <w:r>
+        <w:t xml:space="preserve">, 1 </w:t>
+      </w:r>
+      <w:proofErr w:type="spellStart"/>
+      <w:r>
+        <w:t>px’lik</w:t>
+      </w:r>
+      <w:proofErr w:type="spellEnd"/>
+      <w:r>
+        <w:t xml:space="preserve"> </w:t>
+      </w:r>
+      <w:proofErr w:type="spellStart"/>
+      <w:r>
+        <w:t>adımlarla</w:t>
+      </w:r>
+      <w:proofErr w:type="spellEnd"/>
+      <w:r>
+        <w:t xml:space="preserve"> </w:t>
+      </w:r>
+      <w:proofErr w:type="spellStart"/>
+      <w:r>
+        <w:t>çözüldü</w:t>
+      </w:r>
+      <w:proofErr w:type="spellEnd"/>
     </w:p>
     <w:p>
       <w:r>
-        <w:t>• Canavarlar öldüğünde 20 saniye sonra aynı yerde yeniden doğuyor</w:t>
-      </w:r>
+        <w:t xml:space="preserve">• </w:t>
+      </w:r>
+      <w:proofErr w:type="spellStart"/>
+      <w:r>
+        <w:t>Canavarlar</w:t>
+      </w:r>
+      <w:proofErr w:type="spellEnd"/>
+      <w:r>
+        <w:t xml:space="preserve"> </w:t>
+      </w:r>
+      <w:proofErr w:type="spellStart"/>
+      <w:r>
+        <w:t>öldüğünde</w:t>
+      </w:r>
+      <w:proofErr w:type="spellEnd"/>
+      <w:r>
+        <w:t xml:space="preserve"> 20 </w:t>
+      </w:r>
+      <w:proofErr w:type="spellStart"/>
+      <w:r>
+        <w:t>saniye</w:t>
+      </w:r>
+      <w:proofErr w:type="spellEnd"/>
+      <w:r>
+        <w:t xml:space="preserve"> </w:t>
+      </w:r>
+      <w:proofErr w:type="spellStart"/>
+      <w:r>
+        <w:t>sonra</w:t>
+      </w:r>
+      <w:proofErr w:type="spellEnd"/>
+      <w:r>
+        <w:t xml:space="preserve"> </w:t>
+      </w:r>
+      <w:proofErr w:type="spellStart"/>
+      <w:r>
+        <w:t>aynı</w:t>
+      </w:r>
+      <w:proofErr w:type="spellEnd"/>
+      <w:r>
+        <w:t xml:space="preserve"> </w:t>
+      </w:r>
+      <w:proofErr w:type="spellStart"/>
+      <w:r>
+        <w:t>yerde</w:t>
+      </w:r>
+      <w:proofErr w:type="spellEnd"/>
+      <w:r>
+        <w:t xml:space="preserve"> </w:t>
+      </w:r>
+      <w:proofErr w:type="spellStart"/>
+      <w:r>
+        <w:t>yeniden</w:t>
+      </w:r>
+      <w:proofErr w:type="spellEnd"/>
+      <w:r>
+        <w:t xml:space="preserve"> </w:t>
+      </w:r>
+      <w:proofErr w:type="spellStart"/>
+      <w:r>
+        <w:t>doğuyor</w:t>
+      </w:r>
+      <w:proofErr w:type="spellEnd"/>
     </w:p>
     <w:p>
       <w:r>
-        <w:t>• Game Over ekranına Y/N tuşları eklendi</w:t>
-      </w:r>
+        <w:t xml:space="preserve">• Game Over </w:t>
+      </w:r>
+      <w:proofErr w:type="spellStart"/>
+      <w:r>
+        <w:t>ekranına</w:t>
+      </w:r>
+      <w:proofErr w:type="spellEnd"/>
+      <w:r>
+        <w:t xml:space="preserve"> Y/N </w:t>
+      </w:r>
+      <w:proofErr w:type="spellStart"/>
+      <w:r>
+        <w:t>tuşları</w:t>
+      </w:r>
+      <w:proofErr w:type="spellEnd"/>
+      <w:r>
+        <w:t xml:space="preserve"> </w:t>
+      </w:r>
+      <w:proofErr w:type="spellStart"/>
+      <w:r>
+        <w:t>eklendi</w:t>
+      </w:r>
+      <w:proofErr w:type="spellEnd"/>
     </w:p>
     <w:p>
       <w:r>
-        <w:t>• API uçları Postman ile test edildi, loot loglandı</w:t>
-      </w:r>
+        <w:t xml:space="preserve">• API </w:t>
+      </w:r>
+      <w:proofErr w:type="spellStart"/>
+      <w:r>
+        <w:t>uçları</w:t>
+      </w:r>
+      <w:proofErr w:type="spellEnd"/>
+      <w:r>
+        <w:t xml:space="preserve"> Postman </w:t>
+      </w:r>
+      <w:proofErr w:type="spellStart"/>
+      <w:r>
+        <w:t>ile</w:t>
+      </w:r>
+      <w:proofErr w:type="spellEnd"/>
+      <w:r>
+        <w:t xml:space="preserve"> test </w:t>
+      </w:r>
+      <w:proofErr w:type="spellStart"/>
+      <w:r>
+        <w:t>edildi</w:t>
+      </w:r>
+      <w:proofErr w:type="spellEnd"/>
+      <w:r>
+        <w:t xml:space="preserve">, loot </w:t>
+      </w:r>
+      <w:proofErr w:type="spellStart"/>
+      <w:r>
+        <w:t>loglandı</w:t>
+      </w:r>
+      <w:proofErr w:type="spellEnd"/>
     </w:p>
     <w:sectPr>
       <w:pgSz w:w="12240" w:h="15840"/>

</xml_diff>